<commit_message>
Journals: [FLAG]/[DECISION] badges, orange/yellow shading, per-sub-strand 'Needs your attention' list with jump links; regenerated journals
Co-Authored-By: Claude Sonnet 5.5 <noreply@anthropic.com>
</commit_message>
<xml_diff>
--- a/data/revised_2026-10_full/journal/Journal_Essential_Mathematics.docx
+++ b/data/revised_2026-10_full/journal/Journal_Essential_Mathematics.docx
@@ -82,10 +82,20 @@
       <w:r>
         <w:rPr>
           <w:rFonts w:ascii="Arial" w:cs="Arial" w:eastAsia="Arial" w:hAnsi="Arial"/>
+          <w:b/>
+          <w:bCs/>
           <w:sz w:val="17"/>
           <w:szCs w:val="17"/>
         </w:rPr>
-        <w:t xml:space="preserve">Rows shaded yellow need a teacher decision (a judgement call or a flag with no change made).</w:t>
+        <w:t xml:space="preserve">Items that need YOUR attention are marked and shaded: </w:t>
+      </w:r>
+      <w:r>
+        <w:rPr>
+          <w:rFonts w:ascii="Arial" w:cs="Arial" w:eastAsia="Arial" w:hAnsi="Arial"/>
+          <w:sz w:val="17"/>
+          <w:szCs w:val="17"/>
+        </w:rPr>
+        <w:t xml:space="preserve">ORANGE rows carry [FLAG]: a problem or question where no text was changed and you must decide what to do. YELLOW rows carry [DECISION]: Claude proposed a change that depends on a judgement call, please confirm it. To jump to them, press Ctrl+F and search for  [FLAG]  or  [DECISION] , or use the "Needs your attention" list at the top of each sub-strand (click an item number to jump to it).</w:t>
       </w:r>
     </w:p>
     <w:p>
@@ -354,6 +364,9 @@
         </w:tc>
       </w:tr>
       <w:tr>
+        <w:trPr>
+          <w:cantSplit w:val="false"/>
+        </w:trPr>
         <w:tc>
           <w:tcPr>
             <w:tcW w:type="dxa" w:w="5000"/>
@@ -536,6 +549,9 @@
         </w:tc>
       </w:tr>
       <w:tr>
+        <w:trPr>
+          <w:cantSplit w:val="false"/>
+        </w:trPr>
         <w:tc>
           <w:tcPr>
             <w:tcW w:type="dxa" w:w="5000"/>
@@ -718,6 +734,9 @@
         </w:tc>
       </w:tr>
       <w:tr>
+        <w:trPr>
+          <w:cantSplit w:val="false"/>
+        </w:trPr>
         <w:tc>
           <w:tcPr>
             <w:tcW w:type="dxa" w:w="5000"/>
@@ -1245,6 +1264,1021 @@
         <w:t xml:space="preserve"/>
       </w:r>
     </w:p>
+    <w:p>
+      <w:pPr>
+        <w:keepNext/>
+        <w:spacing w:after="60" w:before="60"/>
+      </w:pPr>
+      <w:r>
+        <w:rPr>
+          <w:rFonts w:ascii="Arial" w:cs="Arial" w:eastAsia="Arial" w:hAnsi="Arial"/>
+          <w:b/>
+          <w:bCs/>
+          <w:color w:val="C00000"/>
+          <w:sz w:val="20"/>
+          <w:szCs w:val="20"/>
+        </w:rPr>
+        <w:t xml:space="preserve">Needs your attention: 6 items (2 [FLAG], 4 [DECISION])</w:t>
+      </w:r>
+    </w:p>
+    <w:tbl>
+      <w:tblPr>
+        <w:tblW w:type="dxa" w:w="13680"/>
+        <w:tblBorders>
+          <w:top w:val="single" w:color="auto" w:sz="4"/>
+          <w:left w:val="single" w:color="auto" w:sz="4"/>
+          <w:bottom w:val="single" w:color="auto" w:sz="4"/>
+          <w:right w:val="single" w:color="auto" w:sz="4"/>
+          <w:insideH w:val="single" w:color="auto" w:sz="4"/>
+          <w:insideV w:val="single" w:color="auto" w:sz="4"/>
+        </w:tblBorders>
+      </w:tblPr>
+      <w:tblGrid>
+        <w:gridCol w:w="2300"/>
+        <w:gridCol w:w="2300"/>
+        <w:gridCol w:w="3300"/>
+        <w:gridCol w:w="5780"/>
+      </w:tblGrid>
+      <w:tr>
+        <w:trPr>
+          <w:cantSplit/>
+          <w:tblHeader/>
+        </w:trPr>
+        <w:tc>
+          <w:tcPr>
+            <w:tcW w:type="dxa" w:w="2300"/>
+            <w:tcBorders>
+              <w:top w:val="single" w:color="999999" w:sz="4"/>
+              <w:left w:val="single" w:color="999999" w:sz="4"/>
+              <w:bottom w:val="single" w:color="999999" w:sz="4"/>
+              <w:right w:val="single" w:color="999999" w:sz="4"/>
+            </w:tcBorders>
+            <w:shd w:fill="D5E8F0" w:color="auto" w:val="clear"/>
+            <w:tcMar>
+              <w:top w:type="dxa" w:w="50"/>
+              <w:left w:type="dxa" w:w="80"/>
+              <w:bottom w:type="dxa" w:w="50"/>
+              <w:right w:type="dxa" w:w="80"/>
+            </w:tcMar>
+          </w:tcPr>
+          <w:p>
+            <w:pPr>
+              <w:spacing w:after="60" w:before="0"/>
+            </w:pPr>
+            <w:r>
+              <w:rPr>
+                <w:rFonts w:ascii="Arial" w:cs="Arial" w:eastAsia="Arial" w:hAnsi="Arial"/>
+                <w:b/>
+                <w:bCs/>
+                <w:sz w:val="17"/>
+                <w:szCs w:val="17"/>
+              </w:rPr>
+              <w:t xml:space="preserve">Item (click to jump)</w:t>
+            </w:r>
+          </w:p>
+        </w:tc>
+        <w:tc>
+          <w:tcPr>
+            <w:tcW w:type="dxa" w:w="2300"/>
+            <w:tcBorders>
+              <w:top w:val="single" w:color="999999" w:sz="4"/>
+              <w:left w:val="single" w:color="999999" w:sz="4"/>
+              <w:bottom w:val="single" w:color="999999" w:sz="4"/>
+              <w:right w:val="single" w:color="999999" w:sz="4"/>
+            </w:tcBorders>
+            <w:shd w:fill="D5E8F0" w:color="auto" w:val="clear"/>
+            <w:tcMar>
+              <w:top w:type="dxa" w:w="50"/>
+              <w:left w:type="dxa" w:w="80"/>
+              <w:bottom w:type="dxa" w:w="50"/>
+              <w:right w:type="dxa" w:w="80"/>
+            </w:tcMar>
+          </w:tcPr>
+          <w:p>
+            <w:pPr>
+              <w:spacing w:after="60" w:before="0"/>
+            </w:pPr>
+            <w:r>
+              <w:rPr>
+                <w:rFonts w:ascii="Arial" w:cs="Arial" w:eastAsia="Arial" w:hAnsi="Arial"/>
+                <w:b/>
+                <w:bCs/>
+                <w:sz w:val="17"/>
+                <w:szCs w:val="17"/>
+              </w:rPr>
+              <w:t xml:space="preserve">Type</w:t>
+            </w:r>
+          </w:p>
+        </w:tc>
+        <w:tc>
+          <w:tcPr>
+            <w:tcW w:type="dxa" w:w="3300"/>
+            <w:tcBorders>
+              <w:top w:val="single" w:color="999999" w:sz="4"/>
+              <w:left w:val="single" w:color="999999" w:sz="4"/>
+              <w:bottom w:val="single" w:color="999999" w:sz="4"/>
+              <w:right w:val="single" w:color="999999" w:sz="4"/>
+            </w:tcBorders>
+            <w:shd w:fill="D5E8F0" w:color="auto" w:val="clear"/>
+            <w:tcMar>
+              <w:top w:type="dxa" w:w="50"/>
+              <w:left w:type="dxa" w:w="80"/>
+              <w:bottom w:type="dxa" w:w="50"/>
+              <w:right w:type="dxa" w:w="80"/>
+            </w:tcMar>
+          </w:tcPr>
+          <w:p>
+            <w:pPr>
+              <w:spacing w:after="60" w:before="0"/>
+            </w:pPr>
+            <w:r>
+              <w:rPr>
+                <w:rFonts w:ascii="Arial" w:cs="Arial" w:eastAsia="Arial" w:hAnsi="Arial"/>
+                <w:b/>
+                <w:bCs/>
+                <w:sz w:val="17"/>
+                <w:szCs w:val="17"/>
+              </w:rPr>
+              <w:t xml:space="preserve">Where</w:t>
+            </w:r>
+          </w:p>
+        </w:tc>
+        <w:tc>
+          <w:tcPr>
+            <w:tcW w:type="dxa" w:w="5780"/>
+            <w:tcBorders>
+              <w:top w:val="single" w:color="999999" w:sz="4"/>
+              <w:left w:val="single" w:color="999999" w:sz="4"/>
+              <w:bottom w:val="single" w:color="999999" w:sz="4"/>
+              <w:right w:val="single" w:color="999999" w:sz="4"/>
+            </w:tcBorders>
+            <w:shd w:fill="D5E8F0" w:color="auto" w:val="clear"/>
+            <w:tcMar>
+              <w:top w:type="dxa" w:w="50"/>
+              <w:left w:type="dxa" w:w="80"/>
+              <w:bottom w:type="dxa" w:w="50"/>
+              <w:right w:type="dxa" w:w="80"/>
+            </w:tcMar>
+          </w:tcPr>
+          <w:p>
+            <w:pPr>
+              <w:spacing w:after="60" w:before="0"/>
+            </w:pPr>
+            <w:r>
+              <w:rPr>
+                <w:rFonts w:ascii="Arial" w:cs="Arial" w:eastAsia="Arial" w:hAnsi="Arial"/>
+                <w:b/>
+                <w:bCs/>
+                <w:sz w:val="17"/>
+                <w:szCs w:val="17"/>
+              </w:rPr>
+              <w:t xml:space="preserve">What</w:t>
+            </w:r>
+          </w:p>
+        </w:tc>
+      </w:tr>
+      <w:tr>
+        <w:trPr>
+          <w:cantSplit/>
+        </w:trPr>
+        <w:tc>
+          <w:tcPr>
+            <w:tcW w:type="dxa" w:w="2300"/>
+            <w:tcBorders>
+              <w:top w:val="single" w:color="999999" w:sz="4"/>
+              <w:left w:val="single" w:color="999999" w:sz="4"/>
+              <w:bottom w:val="single" w:color="999999" w:sz="4"/>
+              <w:right w:val="single" w:color="999999" w:sz="4"/>
+            </w:tcBorders>
+            <w:shd w:fill="FFF2CC" w:color="auto" w:val="clear"/>
+            <w:tcMar>
+              <w:top w:type="dxa" w:w="50"/>
+              <w:left w:type="dxa" w:w="80"/>
+              <w:bottom w:type="dxa" w:w="50"/>
+              <w:right w:type="dxa" w:w="80"/>
+            </w:tcMar>
+          </w:tcPr>
+          <w:p>
+            <w:pPr>
+              <w:spacing w:after="40"/>
+            </w:pPr>
+            <w:hyperlink w:history="1" w:anchor="i_essmath_1_3_G4">
+              <w:r>
+                <w:rPr>
+                  <w:rFonts w:ascii="Arial" w:cs="Arial" w:eastAsia="Arial" w:hAnsi="Arial"/>
+                  <w:b/>
+                  <w:bCs/>
+                  <w:color w:val="0563C1"/>
+                  <w:sz w:val="17"/>
+                  <w:szCs w:val="17"/>
+                  <w:u w:val="single"/>
+                </w:rPr>
+                <w:t xml:space="preserve">essmath_1_3 G4</w:t>
+              </w:r>
+            </w:hyperlink>
+          </w:p>
+        </w:tc>
+        <w:tc>
+          <w:tcPr>
+            <w:tcW w:type="dxa" w:w="2300"/>
+            <w:tcBorders>
+              <w:top w:val="single" w:color="999999" w:sz="4"/>
+              <w:left w:val="single" w:color="999999" w:sz="4"/>
+              <w:bottom w:val="single" w:color="999999" w:sz="4"/>
+              <w:right w:val="single" w:color="999999" w:sz="4"/>
+            </w:tcBorders>
+            <w:shd w:fill="FFF2CC" w:color="auto" w:val="clear"/>
+            <w:tcMar>
+              <w:top w:type="dxa" w:w="50"/>
+              <w:left w:type="dxa" w:w="80"/>
+              <w:bottom w:type="dxa" w:w="50"/>
+              <w:right w:type="dxa" w:w="80"/>
+            </w:tcMar>
+          </w:tcPr>
+          <w:p>
+            <w:pPr>
+              <w:spacing w:after="60" w:before="0"/>
+            </w:pPr>
+            <w:r>
+              <w:rPr>
+                <w:rFonts w:ascii="Arial" w:cs="Arial" w:eastAsia="Arial" w:hAnsi="Arial"/>
+                <w:b/>
+                <w:bCs/>
+                <w:color w:val="C55A11"/>
+                <w:sz w:val="17"/>
+                <w:szCs w:val="17"/>
+              </w:rPr>
+              <w:t xml:space="preserve">[DECISION] change proposed</w:t>
+            </w:r>
+          </w:p>
+        </w:tc>
+        <w:tc>
+          <w:tcPr>
+            <w:tcW w:type="dxa" w:w="3300"/>
+            <w:tcBorders>
+              <w:top w:val="single" w:color="999999" w:sz="4"/>
+              <w:left w:val="single" w:color="999999" w:sz="4"/>
+              <w:bottom w:val="single" w:color="999999" w:sz="4"/>
+              <w:right w:val="single" w:color="999999" w:sz="4"/>
+            </w:tcBorders>
+            <w:shd w:fill="FFF2CC" w:color="auto" w:val="clear"/>
+            <w:tcMar>
+              <w:top w:type="dxa" w:w="50"/>
+              <w:left w:type="dxa" w:w="80"/>
+              <w:bottom w:type="dxa" w:w="50"/>
+              <w:right w:type="dxa" w:w="80"/>
+            </w:tcMar>
+          </w:tcPr>
+          <w:p>
+            <w:pPr>
+              <w:spacing w:after="60" w:before="0"/>
+            </w:pPr>
+            <w:r>
+              <w:rPr>
+                <w:rFonts w:ascii="Arial" w:cs="Arial" w:eastAsia="Arial" w:hAnsi="Arial"/>
+                <w:sz w:val="17"/>
+                <w:szCs w:val="17"/>
+              </w:rPr>
+              <w:t xml:space="preserve">Lesson 8, Driving Question Board (DQB) Creation, teacherMoves</w:t>
+            </w:r>
+          </w:p>
+        </w:tc>
+        <w:tc>
+          <w:tcPr>
+            <w:tcW w:type="dxa" w:w="5780"/>
+            <w:tcBorders>
+              <w:top w:val="single" w:color="999999" w:sz="4"/>
+              <w:left w:val="single" w:color="999999" w:sz="4"/>
+              <w:bottom w:val="single" w:color="999999" w:sz="4"/>
+              <w:right w:val="single" w:color="999999" w:sz="4"/>
+            </w:tcBorders>
+            <w:shd w:fill="FFF2CC" w:color="auto" w:val="clear"/>
+            <w:tcMar>
+              <w:top w:type="dxa" w:w="50"/>
+              <w:left w:type="dxa" w:w="80"/>
+              <w:bottom w:type="dxa" w:w="50"/>
+              <w:right w:type="dxa" w:w="80"/>
+            </w:tcMar>
+          </w:tcPr>
+          <w:p>
+            <w:pPr>
+              <w:spacing w:after="60" w:before="0"/>
+            </w:pPr>
+            <w:r>
+              <w:rPr>
+                <w:rFonts w:ascii="Arial" w:cs="Arial" w:eastAsia="Arial" w:hAnsi="Arial"/>
+                <w:sz w:val="17"/>
+                <w:szCs w:val="17"/>
+              </w:rPr>
+              <w:t xml:space="preserve">A Driving Question Board question ('Can factorisation always work?') was promised an answer in Lessons 5, 6 and 7 but never got one; it now stays on the board and is answered directly in the Lesson 8 review. Teachers had no answer to give for 'Can factorisati…</w:t>
+            </w:r>
+          </w:p>
+        </w:tc>
+      </w:tr>
+      <w:tr>
+        <w:trPr>
+          <w:cantSplit/>
+        </w:trPr>
+        <w:tc>
+          <w:tcPr>
+            <w:tcW w:type="dxa" w:w="2300"/>
+            <w:tcBorders>
+              <w:top w:val="single" w:color="999999" w:sz="4"/>
+              <w:left w:val="single" w:color="999999" w:sz="4"/>
+              <w:bottom w:val="single" w:color="999999" w:sz="4"/>
+              <w:right w:val="single" w:color="999999" w:sz="4"/>
+            </w:tcBorders>
+            <w:shd w:fill="FFF2CC" w:color="auto" w:val="clear"/>
+            <w:tcMar>
+              <w:top w:type="dxa" w:w="50"/>
+              <w:left w:type="dxa" w:w="80"/>
+              <w:bottom w:type="dxa" w:w="50"/>
+              <w:right w:type="dxa" w:w="80"/>
+            </w:tcMar>
+          </w:tcPr>
+          <w:p>
+            <w:pPr>
+              <w:spacing w:after="40"/>
+            </w:pPr>
+            <w:hyperlink w:history="1" w:anchor="i_essmath_1_3_G6">
+              <w:r>
+                <w:rPr>
+                  <w:rFonts w:ascii="Arial" w:cs="Arial" w:eastAsia="Arial" w:hAnsi="Arial"/>
+                  <w:b/>
+                  <w:bCs/>
+                  <w:color w:val="0563C1"/>
+                  <w:sz w:val="17"/>
+                  <w:szCs w:val="17"/>
+                  <w:u w:val="single"/>
+                </w:rPr>
+                <w:t xml:space="preserve">essmath_1_3 G6</w:t>
+              </w:r>
+            </w:hyperlink>
+          </w:p>
+        </w:tc>
+        <w:tc>
+          <w:tcPr>
+            <w:tcW w:type="dxa" w:w="2300"/>
+            <w:tcBorders>
+              <w:top w:val="single" w:color="999999" w:sz="4"/>
+              <w:left w:val="single" w:color="999999" w:sz="4"/>
+              <w:bottom w:val="single" w:color="999999" w:sz="4"/>
+              <w:right w:val="single" w:color="999999" w:sz="4"/>
+            </w:tcBorders>
+            <w:shd w:fill="FFF2CC" w:color="auto" w:val="clear"/>
+            <w:tcMar>
+              <w:top w:type="dxa" w:w="50"/>
+              <w:left w:type="dxa" w:w="80"/>
+              <w:bottom w:type="dxa" w:w="50"/>
+              <w:right w:type="dxa" w:w="80"/>
+            </w:tcMar>
+          </w:tcPr>
+          <w:p>
+            <w:pPr>
+              <w:spacing w:after="60" w:before="0"/>
+            </w:pPr>
+            <w:r>
+              <w:rPr>
+                <w:rFonts w:ascii="Arial" w:cs="Arial" w:eastAsia="Arial" w:hAnsi="Arial"/>
+                <w:b/>
+                <w:bCs/>
+                <w:color w:val="C55A11"/>
+                <w:sz w:val="17"/>
+                <w:szCs w:val="17"/>
+              </w:rPr>
+              <w:t xml:space="preserve">[DECISION] change proposed</w:t>
+            </w:r>
+          </w:p>
+        </w:tc>
+        <w:tc>
+          <w:tcPr>
+            <w:tcW w:type="dxa" w:w="3300"/>
+            <w:tcBorders>
+              <w:top w:val="single" w:color="999999" w:sz="4"/>
+              <w:left w:val="single" w:color="999999" w:sz="4"/>
+              <w:bottom w:val="single" w:color="999999" w:sz="4"/>
+              <w:right w:val="single" w:color="999999" w:sz="4"/>
+            </w:tcBorders>
+            <w:shd w:fill="FFF2CC" w:color="auto" w:val="clear"/>
+            <w:tcMar>
+              <w:top w:type="dxa" w:w="50"/>
+              <w:left w:type="dxa" w:w="80"/>
+              <w:bottom w:type="dxa" w:w="50"/>
+              <w:right w:type="dxa" w:w="80"/>
+            </w:tcMar>
+          </w:tcPr>
+          <w:p>
+            <w:pPr>
+              <w:spacing w:after="60" w:before="0"/>
+            </w:pPr>
+            <w:r>
+              <w:rPr>
+                <w:rFonts w:ascii="Arial" w:cs="Arial" w:eastAsia="Arial" w:hAnsi="Arial"/>
+                <w:sz w:val="17"/>
+                <w:szCs w:val="17"/>
+              </w:rPr>
+              <w:t xml:space="preserve">Lesson 6, Observe Phase, learnerExperience</w:t>
+            </w:r>
+          </w:p>
+        </w:tc>
+        <w:tc>
+          <w:tcPr>
+            <w:tcW w:type="dxa" w:w="5780"/>
+            <w:tcBorders>
+              <w:top w:val="single" w:color="999999" w:sz="4"/>
+              <w:left w:val="single" w:color="999999" w:sz="4"/>
+              <w:bottom w:val="single" w:color="999999" w:sz="4"/>
+              <w:right w:val="single" w:color="999999" w:sz="4"/>
+            </w:tcBorders>
+            <w:shd w:fill="FFF2CC" w:color="auto" w:val="clear"/>
+            <w:tcMar>
+              <w:top w:type="dxa" w:w="50"/>
+              <w:left w:type="dxa" w:w="80"/>
+              <w:bottom w:type="dxa" w:w="50"/>
+              <w:right w:type="dxa" w:w="80"/>
+            </w:tcMar>
+          </w:tcPr>
+          <w:p>
+            <w:pPr>
+              <w:spacing w:after="60" w:before="0"/>
+            </w:pPr>
+            <w:r>
+              <w:rPr>
+                <w:rFonts w:ascii="Arial" w:cs="Arial" w:eastAsia="Arial" w:hAnsi="Arial"/>
+                <w:sz w:val="17"/>
+                <w:szCs w:val="17"/>
+              </w:rPr>
+              <w:t xml:space="preserve">Lesson 6 could not fit in 40 minutes (four full problems plus peer checks); now all pairs do Problem 1 and one of Problems 2-4, with a time plan that adds to 40 minutes. Lesson 6 is a 40-minute period but asked pairs to do four problems with full factorisatio…</w:t>
+            </w:r>
+          </w:p>
+        </w:tc>
+      </w:tr>
+      <w:tr>
+        <w:trPr>
+          <w:cantSplit/>
+        </w:trPr>
+        <w:tc>
+          <w:tcPr>
+            <w:tcW w:type="dxa" w:w="2300"/>
+            <w:tcBorders>
+              <w:top w:val="single" w:color="999999" w:sz="4"/>
+              <w:left w:val="single" w:color="999999" w:sz="4"/>
+              <w:bottom w:val="single" w:color="999999" w:sz="4"/>
+              <w:right w:val="single" w:color="999999" w:sz="4"/>
+            </w:tcBorders>
+            <w:shd w:fill="FFF2CC" w:color="auto" w:val="clear"/>
+            <w:tcMar>
+              <w:top w:type="dxa" w:w="50"/>
+              <w:left w:type="dxa" w:w="80"/>
+              <w:bottom w:type="dxa" w:w="50"/>
+              <w:right w:type="dxa" w:w="80"/>
+            </w:tcMar>
+          </w:tcPr>
+          <w:p>
+            <w:pPr>
+              <w:spacing w:after="40"/>
+            </w:pPr>
+            <w:hyperlink w:history="1" w:anchor="i_essmath_1_3_G9">
+              <w:r>
+                <w:rPr>
+                  <w:rFonts w:ascii="Arial" w:cs="Arial" w:eastAsia="Arial" w:hAnsi="Arial"/>
+                  <w:b/>
+                  <w:bCs/>
+                  <w:color w:val="0563C1"/>
+                  <w:sz w:val="17"/>
+                  <w:szCs w:val="17"/>
+                  <w:u w:val="single"/>
+                </w:rPr>
+                <w:t xml:space="preserve">essmath_1_3 G9</w:t>
+              </w:r>
+            </w:hyperlink>
+          </w:p>
+        </w:tc>
+        <w:tc>
+          <w:tcPr>
+            <w:tcW w:type="dxa" w:w="2300"/>
+            <w:tcBorders>
+              <w:top w:val="single" w:color="999999" w:sz="4"/>
+              <w:left w:val="single" w:color="999999" w:sz="4"/>
+              <w:bottom w:val="single" w:color="999999" w:sz="4"/>
+              <w:right w:val="single" w:color="999999" w:sz="4"/>
+            </w:tcBorders>
+            <w:shd w:fill="FFF2CC" w:color="auto" w:val="clear"/>
+            <w:tcMar>
+              <w:top w:type="dxa" w:w="50"/>
+              <w:left w:type="dxa" w:w="80"/>
+              <w:bottom w:type="dxa" w:w="50"/>
+              <w:right w:type="dxa" w:w="80"/>
+            </w:tcMar>
+          </w:tcPr>
+          <w:p>
+            <w:pPr>
+              <w:spacing w:after="60" w:before="0"/>
+            </w:pPr>
+            <w:r>
+              <w:rPr>
+                <w:rFonts w:ascii="Arial" w:cs="Arial" w:eastAsia="Arial" w:hAnsi="Arial"/>
+                <w:b/>
+                <w:bCs/>
+                <w:color w:val="C55A11"/>
+                <w:sz w:val="17"/>
+                <w:szCs w:val="17"/>
+              </w:rPr>
+              <w:t xml:space="preserve">[DECISION] change proposed</w:t>
+            </w:r>
+          </w:p>
+        </w:tc>
+        <w:tc>
+          <w:tcPr>
+            <w:tcW w:type="dxa" w:w="3300"/>
+            <w:tcBorders>
+              <w:top w:val="single" w:color="999999" w:sz="4"/>
+              <w:left w:val="single" w:color="999999" w:sz="4"/>
+              <w:bottom w:val="single" w:color="999999" w:sz="4"/>
+              <w:right w:val="single" w:color="999999" w:sz="4"/>
+            </w:tcBorders>
+            <w:shd w:fill="FFF2CC" w:color="auto" w:val="clear"/>
+            <w:tcMar>
+              <w:top w:type="dxa" w:w="50"/>
+              <w:left w:type="dxa" w:w="80"/>
+              <w:bottom w:type="dxa" w:w="50"/>
+              <w:right w:type="dxa" w:w="80"/>
+            </w:tcMar>
+          </w:tcPr>
+          <w:p>
+            <w:pPr>
+              <w:spacing w:after="60" w:before="0"/>
+            </w:pPr>
+            <w:r>
+              <w:rPr>
+                <w:rFonts w:ascii="Arial" w:cs="Arial" w:eastAsia="Arial" w:hAnsi="Arial"/>
+                <w:sz w:val="17"/>
+                <w:szCs w:val="17"/>
+              </w:rPr>
+              <w:t xml:space="preserve">Lesson 8, Explain Phase, learnerExperience</w:t>
+            </w:r>
+          </w:p>
+        </w:tc>
+        <w:tc>
+          <w:tcPr>
+            <w:tcW w:type="dxa" w:w="5780"/>
+            <w:tcBorders>
+              <w:top w:val="single" w:color="999999" w:sz="4"/>
+              <w:left w:val="single" w:color="999999" w:sz="4"/>
+              <w:bottom w:val="single" w:color="999999" w:sz="4"/>
+              <w:right w:val="single" w:color="999999" w:sz="4"/>
+            </w:tcBorders>
+            <w:shd w:fill="FFF2CC" w:color="auto" w:val="clear"/>
+            <w:tcMar>
+              <w:top w:type="dxa" w:w="50"/>
+              <w:left w:type="dxa" w:w="80"/>
+              <w:bottom w:type="dxa" w:w="50"/>
+              <w:right w:type="dxa" w:w="80"/>
+            </w:tcMar>
+          </w:tcPr>
+          <w:p>
+            <w:pPr>
+              <w:spacing w:after="60" w:before="0"/>
+            </w:pPr>
+            <w:r>
+              <w:rPr>
+                <w:rFonts w:ascii="Arial" w:cs="Arial" w:eastAsia="Arial" w:hAnsi="Arial"/>
+                <w:sz w:val="17"/>
+                <w:szCs w:val="17"/>
+              </w:rPr>
+              <w:t xml:space="preserve">Lesson 8 could not fit in 80 minutes (every group presenting, a 20-minute test and a 10-minute career talk); trimmed so the phases add up to 80 minutes. Lesson 8 needed well over 80 minutes: a 15-minute build, ten or more 3-minute presentations, a 20-minute w…</w:t>
+            </w:r>
+          </w:p>
+        </w:tc>
+      </w:tr>
+      <w:tr>
+        <w:trPr>
+          <w:cantSplit/>
+        </w:trPr>
+        <w:tc>
+          <w:tcPr>
+            <w:tcW w:type="dxa" w:w="2300"/>
+            <w:tcBorders>
+              <w:top w:val="single" w:color="999999" w:sz="4"/>
+              <w:left w:val="single" w:color="999999" w:sz="4"/>
+              <w:bottom w:val="single" w:color="999999" w:sz="4"/>
+              <w:right w:val="single" w:color="999999" w:sz="4"/>
+            </w:tcBorders>
+            <w:shd w:fill="FFF2CC" w:color="auto" w:val="clear"/>
+            <w:tcMar>
+              <w:top w:type="dxa" w:w="50"/>
+              <w:left w:type="dxa" w:w="80"/>
+              <w:bottom w:type="dxa" w:w="50"/>
+              <w:right w:type="dxa" w:w="80"/>
+            </w:tcMar>
+          </w:tcPr>
+          <w:p>
+            <w:pPr>
+              <w:spacing w:after="40"/>
+            </w:pPr>
+            <w:hyperlink w:history="1" w:anchor="i_essmath_1_3_G10">
+              <w:r>
+                <w:rPr>
+                  <w:rFonts w:ascii="Arial" w:cs="Arial" w:eastAsia="Arial" w:hAnsi="Arial"/>
+                  <w:b/>
+                  <w:bCs/>
+                  <w:color w:val="0563C1"/>
+                  <w:sz w:val="17"/>
+                  <w:szCs w:val="17"/>
+                  <w:u w:val="single"/>
+                </w:rPr>
+                <w:t xml:space="preserve">essmath_1_3 G10</w:t>
+              </w:r>
+            </w:hyperlink>
+          </w:p>
+        </w:tc>
+        <w:tc>
+          <w:tcPr>
+            <w:tcW w:type="dxa" w:w="2300"/>
+            <w:tcBorders>
+              <w:top w:val="single" w:color="999999" w:sz="4"/>
+              <w:left w:val="single" w:color="999999" w:sz="4"/>
+              <w:bottom w:val="single" w:color="999999" w:sz="4"/>
+              <w:right w:val="single" w:color="999999" w:sz="4"/>
+            </w:tcBorders>
+            <w:shd w:fill="FFF2CC" w:color="auto" w:val="clear"/>
+            <w:tcMar>
+              <w:top w:type="dxa" w:w="50"/>
+              <w:left w:type="dxa" w:w="80"/>
+              <w:bottom w:type="dxa" w:w="50"/>
+              <w:right w:type="dxa" w:w="80"/>
+            </w:tcMar>
+          </w:tcPr>
+          <w:p>
+            <w:pPr>
+              <w:spacing w:after="60" w:before="0"/>
+            </w:pPr>
+            <w:r>
+              <w:rPr>
+                <w:rFonts w:ascii="Arial" w:cs="Arial" w:eastAsia="Arial" w:hAnsi="Arial"/>
+                <w:b/>
+                <w:bCs/>
+                <w:color w:val="C55A11"/>
+                <w:sz w:val="17"/>
+                <w:szCs w:val="17"/>
+              </w:rPr>
+              <w:t xml:space="preserve">[DECISION] change proposed</w:t>
+            </w:r>
+          </w:p>
+        </w:tc>
+        <w:tc>
+          <w:tcPr>
+            <w:tcW w:type="dxa" w:w="3300"/>
+            <w:tcBorders>
+              <w:top w:val="single" w:color="999999" w:sz="4"/>
+              <w:left w:val="single" w:color="999999" w:sz="4"/>
+              <w:bottom w:val="single" w:color="999999" w:sz="4"/>
+              <w:right w:val="single" w:color="999999" w:sz="4"/>
+            </w:tcBorders>
+            <w:shd w:fill="FFF2CC" w:color="auto" w:val="clear"/>
+            <w:tcMar>
+              <w:top w:type="dxa" w:w="50"/>
+              <w:left w:type="dxa" w:w="80"/>
+              <w:bottom w:type="dxa" w:w="50"/>
+              <w:right w:type="dxa" w:w="80"/>
+            </w:tcMar>
+          </w:tcPr>
+          <w:p>
+            <w:pPr>
+              <w:spacing w:after="60" w:before="0"/>
+            </w:pPr>
+            <w:r>
+              <w:rPr>
+                <w:rFonts w:ascii="Arial" w:cs="Arial" w:eastAsia="Arial" w:hAnsi="Arial"/>
+                <w:sz w:val="17"/>
+                <w:szCs w:val="17"/>
+              </w:rPr>
+              <w:t xml:space="preserve">Lesson 1, Predict Phase, teacherMoves</w:t>
+            </w:r>
+          </w:p>
+        </w:tc>
+        <w:tc>
+          <w:tcPr>
+            <w:tcW w:type="dxa" w:w="5780"/>
+            <w:tcBorders>
+              <w:top w:val="single" w:color="999999" w:sz="4"/>
+              <w:left w:val="single" w:color="999999" w:sz="4"/>
+              <w:bottom w:val="single" w:color="999999" w:sz="4"/>
+              <w:right w:val="single" w:color="999999" w:sz="4"/>
+            </w:tcBorders>
+            <w:shd w:fill="FFF2CC" w:color="auto" w:val="clear"/>
+            <w:tcMar>
+              <w:top w:type="dxa" w:w="50"/>
+              <w:left w:type="dxa" w:w="80"/>
+              <w:bottom w:type="dxa" w:w="50"/>
+              <w:right w:type="dxa" w:w="80"/>
+            </w:tcMar>
+          </w:tcPr>
+          <w:p>
+            <w:pPr>
+              <w:spacing w:after="60" w:before="0"/>
+            </w:pPr>
+            <w:r>
+              <w:rPr>
+                <w:rFonts w:ascii="Arial" w:cs="Arial" w:eastAsia="Arial" w:hAnsi="Arial"/>
+                <w:sz w:val="17"/>
+                <w:szCs w:val="17"/>
+              </w:rPr>
+              <w:t xml:space="preserve">No inclusion supports anywhere in the sub-strand; added Kiswahili key words (to be checked by teachers) and one accommodation each in Lessons 1, 4 and 8. No lesson had language supports for English learners. Added key words with Kiswahili beside them and perm…</w:t>
+            </w:r>
+          </w:p>
+        </w:tc>
+      </w:tr>
+      <w:tr>
+        <w:trPr>
+          <w:cantSplit/>
+        </w:trPr>
+        <w:tc>
+          <w:tcPr>
+            <w:tcW w:type="dxa" w:w="2300"/>
+            <w:tcBorders>
+              <w:top w:val="single" w:color="999999" w:sz="4"/>
+              <w:left w:val="single" w:color="999999" w:sz="4"/>
+              <w:bottom w:val="single" w:color="999999" w:sz="4"/>
+              <w:right w:val="single" w:color="999999" w:sz="4"/>
+            </w:tcBorders>
+            <w:shd w:fill="F8CBAD" w:color="auto" w:val="clear"/>
+            <w:tcMar>
+              <w:top w:type="dxa" w:w="50"/>
+              <w:left w:type="dxa" w:w="80"/>
+              <w:bottom w:type="dxa" w:w="50"/>
+              <w:right w:type="dxa" w:w="80"/>
+            </w:tcMar>
+          </w:tcPr>
+          <w:p>
+            <w:pPr>
+              <w:spacing w:after="40"/>
+            </w:pPr>
+            <w:hyperlink w:history="1" w:anchor="i_essmath_1_3_068">
+              <w:r>
+                <w:rPr>
+                  <w:rFonts w:ascii="Arial" w:cs="Arial" w:eastAsia="Arial" w:hAnsi="Arial"/>
+                  <w:b/>
+                  <w:bCs/>
+                  <w:color w:val="0563C1"/>
+                  <w:sz w:val="17"/>
+                  <w:szCs w:val="17"/>
+                  <w:u w:val="single"/>
+                </w:rPr>
+                <w:t xml:space="preserve">essmath_1_3-068</w:t>
+              </w:r>
+            </w:hyperlink>
+          </w:p>
+        </w:tc>
+        <w:tc>
+          <w:tcPr>
+            <w:tcW w:type="dxa" w:w="2300"/>
+            <w:tcBorders>
+              <w:top w:val="single" w:color="999999" w:sz="4"/>
+              <w:left w:val="single" w:color="999999" w:sz="4"/>
+              <w:bottom w:val="single" w:color="999999" w:sz="4"/>
+              <w:right w:val="single" w:color="999999" w:sz="4"/>
+            </w:tcBorders>
+            <w:shd w:fill="F8CBAD" w:color="auto" w:val="clear"/>
+            <w:tcMar>
+              <w:top w:type="dxa" w:w="50"/>
+              <w:left w:type="dxa" w:w="80"/>
+              <w:bottom w:type="dxa" w:w="50"/>
+              <w:right w:type="dxa" w:w="80"/>
+            </w:tcMar>
+          </w:tcPr>
+          <w:p>
+            <w:pPr>
+              <w:spacing w:after="60" w:before="0"/>
+            </w:pPr>
+            <w:r>
+              <w:rPr>
+                <w:rFonts w:ascii="Arial" w:cs="Arial" w:eastAsia="Arial" w:hAnsi="Arial"/>
+                <w:b/>
+                <w:bCs/>
+                <w:color w:val="C00000"/>
+                <w:sz w:val="17"/>
+                <w:szCs w:val="17"/>
+              </w:rPr>
+              <w:t xml:space="preserve">[FLAG] no change made</w:t>
+            </w:r>
+          </w:p>
+        </w:tc>
+        <w:tc>
+          <w:tcPr>
+            <w:tcW w:type="dxa" w:w="3300"/>
+            <w:tcBorders>
+              <w:top w:val="single" w:color="999999" w:sz="4"/>
+              <w:left w:val="single" w:color="999999" w:sz="4"/>
+              <w:bottom w:val="single" w:color="999999" w:sz="4"/>
+              <w:right w:val="single" w:color="999999" w:sz="4"/>
+            </w:tcBorders>
+            <w:shd w:fill="F8CBAD" w:color="auto" w:val="clear"/>
+            <w:tcMar>
+              <w:top w:type="dxa" w:w="50"/>
+              <w:left w:type="dxa" w:w="80"/>
+              <w:bottom w:type="dxa" w:w="50"/>
+              <w:right w:type="dxa" w:w="80"/>
+            </w:tcMar>
+          </w:tcPr>
+          <w:p>
+            <w:pPr>
+              <w:spacing w:after="60" w:before="0"/>
+            </w:pPr>
+            <w:r>
+              <w:rPr>
+                <w:rFonts w:ascii="Arial" w:cs="Arial" w:eastAsia="Arial" w:hAnsi="Arial"/>
+                <w:sz w:val="17"/>
+                <w:szCs w:val="17"/>
+              </w:rPr>
+              <w:t xml:space="preserve">Final Explanation, rubric</w:t>
+            </w:r>
+          </w:p>
+        </w:tc>
+        <w:tc>
+          <w:tcPr>
+            <w:tcW w:type="dxa" w:w="5780"/>
+            <w:tcBorders>
+              <w:top w:val="single" w:color="999999" w:sz="4"/>
+              <w:left w:val="single" w:color="999999" w:sz="4"/>
+              <w:bottom w:val="single" w:color="999999" w:sz="4"/>
+              <w:right w:val="single" w:color="999999" w:sz="4"/>
+            </w:tcBorders>
+            <w:shd w:fill="F8CBAD" w:color="auto" w:val="clear"/>
+            <w:tcMar>
+              <w:top w:type="dxa" w:w="50"/>
+              <w:left w:type="dxa" w:w="80"/>
+              <w:bottom w:type="dxa" w:w="50"/>
+              <w:right w:type="dxa" w:w="80"/>
+            </w:tcMar>
+          </w:tcPr>
+          <w:p>
+            <w:pPr>
+              <w:spacing w:after="60" w:before="0"/>
+            </w:pPr>
+            <w:r>
+              <w:rPr>
+                <w:rFonts w:ascii="Arial" w:cs="Arial" w:eastAsia="Arial" w:hAnsi="Arial"/>
+                <w:sz w:val="17"/>
+                <w:szCs w:val="17"/>
+              </w:rPr>
+              <w:t xml:space="preserve">The contract allows only three level fields (excellent / proficient / developing), so the fourth CBE level, Below Expectations, cannot be represented in the Final Explanation rubric. Suggested: ask the partner whether a fourth field can be added; until then, …</w:t>
+            </w:r>
+          </w:p>
+        </w:tc>
+      </w:tr>
+      <w:tr>
+        <w:trPr>
+          <w:cantSplit/>
+        </w:trPr>
+        <w:tc>
+          <w:tcPr>
+            <w:tcW w:type="dxa" w:w="2300"/>
+            <w:tcBorders>
+              <w:top w:val="single" w:color="999999" w:sz="4"/>
+              <w:left w:val="single" w:color="999999" w:sz="4"/>
+              <w:bottom w:val="single" w:color="999999" w:sz="4"/>
+              <w:right w:val="single" w:color="999999" w:sz="4"/>
+            </w:tcBorders>
+            <w:shd w:fill="F8CBAD" w:color="auto" w:val="clear"/>
+            <w:tcMar>
+              <w:top w:type="dxa" w:w="50"/>
+              <w:left w:type="dxa" w:w="80"/>
+              <w:bottom w:type="dxa" w:w="50"/>
+              <w:right w:type="dxa" w:w="80"/>
+            </w:tcMar>
+          </w:tcPr>
+          <w:p>
+            <w:pPr>
+              <w:spacing w:after="40"/>
+            </w:pPr>
+            <w:hyperlink w:history="1" w:anchor="i_essmath_1_3_069">
+              <w:r>
+                <w:rPr>
+                  <w:rFonts w:ascii="Arial" w:cs="Arial" w:eastAsia="Arial" w:hAnsi="Arial"/>
+                  <w:b/>
+                  <w:bCs/>
+                  <w:color w:val="0563C1"/>
+                  <w:sz w:val="17"/>
+                  <w:szCs w:val="17"/>
+                  <w:u w:val="single"/>
+                </w:rPr>
+                <w:t xml:space="preserve">essmath_1_3-069</w:t>
+              </w:r>
+            </w:hyperlink>
+          </w:p>
+        </w:tc>
+        <w:tc>
+          <w:tcPr>
+            <w:tcW w:type="dxa" w:w="2300"/>
+            <w:tcBorders>
+              <w:top w:val="single" w:color="999999" w:sz="4"/>
+              <w:left w:val="single" w:color="999999" w:sz="4"/>
+              <w:bottom w:val="single" w:color="999999" w:sz="4"/>
+              <w:right w:val="single" w:color="999999" w:sz="4"/>
+            </w:tcBorders>
+            <w:shd w:fill="F8CBAD" w:color="auto" w:val="clear"/>
+            <w:tcMar>
+              <w:top w:type="dxa" w:w="50"/>
+              <w:left w:type="dxa" w:w="80"/>
+              <w:bottom w:type="dxa" w:w="50"/>
+              <w:right w:type="dxa" w:w="80"/>
+            </w:tcMar>
+          </w:tcPr>
+          <w:p>
+            <w:pPr>
+              <w:spacing w:after="60" w:before="0"/>
+            </w:pPr>
+            <w:r>
+              <w:rPr>
+                <w:rFonts w:ascii="Arial" w:cs="Arial" w:eastAsia="Arial" w:hAnsi="Arial"/>
+                <w:b/>
+                <w:bCs/>
+                <w:color w:val="C00000"/>
+                <w:sz w:val="17"/>
+                <w:szCs w:val="17"/>
+              </w:rPr>
+              <w:t xml:space="preserve">[FLAG] no change made</w:t>
+            </w:r>
+          </w:p>
+        </w:tc>
+        <w:tc>
+          <w:tcPr>
+            <w:tcW w:type="dxa" w:w="3300"/>
+            <w:tcBorders>
+              <w:top w:val="single" w:color="999999" w:sz="4"/>
+              <w:left w:val="single" w:color="999999" w:sz="4"/>
+              <w:bottom w:val="single" w:color="999999" w:sz="4"/>
+              <w:right w:val="single" w:color="999999" w:sz="4"/>
+            </w:tcBorders>
+            <w:shd w:fill="F8CBAD" w:color="auto" w:val="clear"/>
+            <w:tcMar>
+              <w:top w:type="dxa" w:w="50"/>
+              <w:left w:type="dxa" w:w="80"/>
+              <w:bottom w:type="dxa" w:w="50"/>
+              <w:right w:type="dxa" w:w="80"/>
+            </w:tcMar>
+          </w:tcPr>
+          <w:p>
+            <w:pPr>
+              <w:spacing w:after="60" w:before="0"/>
+            </w:pPr>
+            <w:r>
+              <w:rPr>
+                <w:rFonts w:ascii="Arial" w:cs="Arial" w:eastAsia="Arial" w:hAnsi="Arial"/>
+                <w:sz w:val="17"/>
+                <w:szCs w:val="17"/>
+              </w:rPr>
+              <w:t xml:space="preserve">Unit overview, learningOutcomes</w:t>
+            </w:r>
+          </w:p>
+        </w:tc>
+        <w:tc>
+          <w:tcPr>
+            <w:tcW w:type="dxa" w:w="5780"/>
+            <w:tcBorders>
+              <w:top w:val="single" w:color="999999" w:sz="4"/>
+              <w:left w:val="single" w:color="999999" w:sz="4"/>
+              <w:bottom w:val="single" w:color="999999" w:sz="4"/>
+              <w:right w:val="single" w:color="999999" w:sz="4"/>
+            </w:tcBorders>
+            <w:shd w:fill="F8CBAD" w:color="auto" w:val="clear"/>
+            <w:tcMar>
+              <w:top w:type="dxa" w:w="50"/>
+              <w:left w:type="dxa" w:w="80"/>
+              <w:bottom w:type="dxa" w:w="50"/>
+              <w:right w:type="dxa" w:w="80"/>
+            </w:tcMar>
+          </w:tcPr>
+          <w:p>
+            <w:pPr>
+              <w:spacing w:after="60" w:before="0"/>
+            </w:pPr>
+            <w:r>
+              <w:rPr>
+                <w:rFonts w:ascii="Arial" w:cs="Arial" w:eastAsia="Arial" w:hAnsi="Arial"/>
+                <w:sz w:val="17"/>
+                <w:szCs w:val="17"/>
+              </w:rPr>
+              <w:t xml:space="preserve">KICD alignment could not be verified. The KICD Grade 10 Mathematics PDF in data/raw/curriculum_pdfs/ is the Core Mathematics design: its Sub-Strand 1.3 is 'Quadratic Expressions and Equations' (16 lessons) with outcomes a-h that include quadratic identities, …</w:t>
+            </w:r>
+          </w:p>
+        </w:tc>
+      </w:tr>
+    </w:tbl>
+    <w:p>
+      <w:pPr>
+        <w:spacing w:after="120" w:before="0"/>
+      </w:pPr>
+      <w:r>
+        <w:rPr>
+          <w:rFonts w:ascii="Arial" w:cs="Arial" w:eastAsia="Arial" w:hAnsi="Arial"/>
+          <w:sz w:val="17"/>
+          <w:szCs w:val="17"/>
+        </w:rPr>
+        <w:t xml:space="preserve"/>
+      </w:r>
+    </w:p>
     <w:tbl>
       <w:tblPr>
         <w:tblW w:type="dxa" w:w="13680"/>
@@ -1470,6 +2504,9 @@
         </w:tc>
       </w:tr>
       <w:tr>
+        <w:trPr>
+          <w:cantSplit w:val="false"/>
+        </w:trPr>
         <w:tc>
           <w:tcPr>
             <w:tcW w:type="dxa" w:w="1300"/>
@@ -1506,6 +2543,7 @@
             <w:pPr>
               <w:spacing w:after="60" w:before="0"/>
             </w:pPr>
+            <w:bookmarkStart w:name="i_essmath_1_3_001" w:id="1"/>
             <w:r>
               <w:rPr>
                 <w:rFonts w:ascii="Arial" w:cs="Arial" w:eastAsia="Arial" w:hAnsi="Arial"/>
@@ -1516,6 +2554,7 @@
               </w:rPr>
               <w:t xml:space="preserve">essmath_1_3-001</w:t>
             </w:r>
+            <w:bookmarkEnd w:id="1"/>
           </w:p>
         </w:tc>
         <w:tc>
@@ -1863,6 +2902,9 @@
         </w:tc>
       </w:tr>
       <w:tr>
+        <w:trPr>
+          <w:cantSplit w:val="false"/>
+        </w:trPr>
         <w:tc>
           <w:tcPr>
             <w:tcW w:type="dxa" w:w="1300"/>
@@ -1899,6 +2941,7 @@
             <w:pPr>
               <w:spacing w:after="60" w:before="0"/>
             </w:pPr>
+            <w:bookmarkStart w:name="i_essmath_1_3_G1" w:id="1"/>
             <w:r>
               <w:rPr>
                 <w:rFonts w:ascii="Arial" w:cs="Arial" w:eastAsia="Arial" w:hAnsi="Arial"/>
@@ -1909,6 +2952,7 @@
               </w:rPr>
               <w:t xml:space="preserve">essmath_1_3 G1 (group)</w:t>
             </w:r>
+            <w:bookmarkEnd w:id="1"/>
           </w:p>
           <w:p>
             <w:pPr>
@@ -2430,6 +3474,9 @@
         </w:tc>
       </w:tr>
       <w:tr>
+        <w:trPr>
+          <w:cantSplit w:val="false"/>
+        </w:trPr>
         <w:tc>
           <w:tcPr>
             <w:tcW w:type="dxa" w:w="1300"/>
@@ -2466,6 +3513,7 @@
             <w:pPr>
               <w:spacing w:after="60" w:before="0"/>
             </w:pPr>
+            <w:bookmarkStart w:name="i_essmath_1_3_G2" w:id="1"/>
             <w:r>
               <w:rPr>
                 <w:rFonts w:ascii="Arial" w:cs="Arial" w:eastAsia="Arial" w:hAnsi="Arial"/>
@@ -2476,6 +3524,7 @@
               </w:rPr>
               <w:t xml:space="preserve">essmath_1_3 G2 (group)</w:t>
             </w:r>
+            <w:bookmarkEnd w:id="1"/>
           </w:p>
           <w:p>
             <w:pPr>
@@ -2933,6 +3982,9 @@
         </w:tc>
       </w:tr>
       <w:tr>
+        <w:trPr>
+          <w:cantSplit w:val="false"/>
+        </w:trPr>
         <w:tc>
           <w:tcPr>
             <w:tcW w:type="dxa" w:w="1300"/>
@@ -2969,6 +4021,7 @@
             <w:pPr>
               <w:spacing w:after="60" w:before="0"/>
             </w:pPr>
+            <w:bookmarkStart w:name="i_essmath_1_3_G3" w:id="1"/>
             <w:r>
               <w:rPr>
                 <w:rFonts w:ascii="Arial" w:cs="Arial" w:eastAsia="Arial" w:hAnsi="Arial"/>
@@ -2979,6 +4032,7 @@
               </w:rPr>
               <w:t xml:space="preserve">essmath_1_3 G3 (group)</w:t>
             </w:r>
+            <w:bookmarkEnd w:id="1"/>
           </w:p>
           <w:p>
             <w:pPr>
@@ -3484,6 +4538,9 @@
         </w:tc>
       </w:tr>
       <w:tr>
+        <w:trPr>
+          <w:cantSplit w:val="false"/>
+        </w:trPr>
         <w:tc>
           <w:tcPr>
             <w:tcW w:type="dxa" w:w="1300"/>
@@ -3521,6 +4578,7 @@
             <w:pPr>
               <w:spacing w:after="60" w:before="0"/>
             </w:pPr>
+            <w:bookmarkStart w:name="i_essmath_1_3_G4" w:id="1"/>
             <w:r>
               <w:rPr>
                 <w:rFonts w:ascii="Arial" w:cs="Arial" w:eastAsia="Arial" w:hAnsi="Arial"/>
@@ -3531,6 +4589,7 @@
               </w:rPr>
               <w:t xml:space="preserve">essmath_1_3 G4 (group)</w:t>
             </w:r>
+            <w:bookmarkEnd w:id="1"/>
           </w:p>
           <w:p>
             <w:pPr>
@@ -3574,10 +4633,10 @@
                 <w:b/>
                 <w:bCs/>
                 <w:color w:val="C55A11"/>
-                <w:sz w:val="14"/>
-                <w:szCs w:val="14"/>
-              </w:rPr>
-              <w:t xml:space="preserve">TEACHER DECISION</w:t>
+                <w:sz w:val="16"/>
+                <w:szCs w:val="16"/>
+              </w:rPr>
+              <w:t xml:space="preserve">[DECISION] CHANGE PROPOSED: PLEASE CONFIRM</w:t>
             </w:r>
           </w:p>
         </w:tc>
@@ -4193,6 +5252,9 @@
         </w:tc>
       </w:tr>
       <w:tr>
+        <w:trPr>
+          <w:cantSplit w:val="false"/>
+        </w:trPr>
         <w:tc>
           <w:tcPr>
             <w:tcW w:type="dxa" w:w="1300"/>
@@ -4229,6 +5291,7 @@
             <w:pPr>
               <w:spacing w:after="60" w:before="0"/>
             </w:pPr>
+            <w:bookmarkStart w:name="i_essmath_1_3_025" w:id="1"/>
             <w:r>
               <w:rPr>
                 <w:rFonts w:ascii="Arial" w:cs="Arial" w:eastAsia="Arial" w:hAnsi="Arial"/>
@@ -4239,6 +5302,7 @@
               </w:rPr>
               <w:t xml:space="preserve">essmath_1_3-025</w:t>
             </w:r>
+            <w:bookmarkEnd w:id="1"/>
           </w:p>
         </w:tc>
         <w:tc>
@@ -4661,6 +5725,9 @@
         </w:tc>
       </w:tr>
       <w:tr>
+        <w:trPr>
+          <w:cantSplit w:val="false"/>
+        </w:trPr>
         <w:tc>
           <w:tcPr>
             <w:tcW w:type="dxa" w:w="1300"/>
@@ -4697,6 +5764,7 @@
             <w:pPr>
               <w:spacing w:after="60" w:before="0"/>
             </w:pPr>
+            <w:bookmarkStart w:name="i_essmath_1_3_026" w:id="1"/>
             <w:r>
               <w:rPr>
                 <w:rFonts w:ascii="Arial" w:cs="Arial" w:eastAsia="Arial" w:hAnsi="Arial"/>
@@ -4707,6 +5775,7 @@
               </w:rPr>
               <w:t xml:space="preserve">essmath_1_3-026</w:t>
             </w:r>
+            <w:bookmarkEnd w:id="1"/>
           </w:p>
         </w:tc>
         <w:tc>
@@ -5054,6 +6123,9 @@
         </w:tc>
       </w:tr>
       <w:tr>
+        <w:trPr>
+          <w:cantSplit w:val="false"/>
+        </w:trPr>
         <w:tc>
           <w:tcPr>
             <w:tcW w:type="dxa" w:w="1300"/>
@@ -5090,6 +6162,7 @@
             <w:pPr>
               <w:spacing w:after="60" w:before="0"/>
             </w:pPr>
+            <w:bookmarkStart w:name="i_essmath_1_3_027" w:id="1"/>
             <w:r>
               <w:rPr>
                 <w:rFonts w:ascii="Arial" w:cs="Arial" w:eastAsia="Arial" w:hAnsi="Arial"/>
@@ -5100,6 +6173,7 @@
               </w:rPr>
               <w:t xml:space="preserve">essmath_1_3-027</w:t>
             </w:r>
+            <w:bookmarkEnd w:id="1"/>
           </w:p>
         </w:tc>
         <w:tc>
@@ -5447,6 +6521,9 @@
         </w:tc>
       </w:tr>
       <w:tr>
+        <w:trPr>
+          <w:cantSplit w:val="false"/>
+        </w:trPr>
         <w:tc>
           <w:tcPr>
             <w:tcW w:type="dxa" w:w="1300"/>
@@ -5483,6 +6560,7 @@
             <w:pPr>
               <w:spacing w:after="60" w:before="0"/>
             </w:pPr>
+            <w:bookmarkStart w:name="i_essmath_1_3_028" w:id="1"/>
             <w:r>
               <w:rPr>
                 <w:rFonts w:ascii="Arial" w:cs="Arial" w:eastAsia="Arial" w:hAnsi="Arial"/>
@@ -5493,6 +6571,7 @@
               </w:rPr>
               <w:t xml:space="preserve">essmath_1_3-028</w:t>
             </w:r>
+            <w:bookmarkEnd w:id="1"/>
           </w:p>
         </w:tc>
         <w:tc>
@@ -5840,6 +6919,9 @@
         </w:tc>
       </w:tr>
       <w:tr>
+        <w:trPr>
+          <w:cantSplit w:val="false"/>
+        </w:trPr>
         <w:tc>
           <w:tcPr>
             <w:tcW w:type="dxa" w:w="1300"/>
@@ -5876,6 +6958,7 @@
             <w:pPr>
               <w:spacing w:after="60" w:before="0"/>
             </w:pPr>
+            <w:bookmarkStart w:name="i_essmath_1_3_029" w:id="1"/>
             <w:r>
               <w:rPr>
                 <w:rFonts w:ascii="Arial" w:cs="Arial" w:eastAsia="Arial" w:hAnsi="Arial"/>
@@ -5886,6 +6969,7 @@
               </w:rPr>
               <w:t xml:space="preserve">essmath_1_3-029</w:t>
             </w:r>
+            <w:bookmarkEnd w:id="1"/>
           </w:p>
         </w:tc>
         <w:tc>
@@ -6233,6 +7317,9 @@
         </w:tc>
       </w:tr>
       <w:tr>
+        <w:trPr>
+          <w:cantSplit w:val="false"/>
+        </w:trPr>
         <w:tc>
           <w:tcPr>
             <w:tcW w:type="dxa" w:w="1300"/>
@@ -6269,6 +7356,7 @@
             <w:pPr>
               <w:spacing w:after="60" w:before="0"/>
             </w:pPr>
+            <w:bookmarkStart w:name="i_essmath_1_3_030" w:id="1"/>
             <w:r>
               <w:rPr>
                 <w:rFonts w:ascii="Arial" w:cs="Arial" w:eastAsia="Arial" w:hAnsi="Arial"/>
@@ -6279,6 +7367,7 @@
               </w:rPr>
               <w:t xml:space="preserve">essmath_1_3-030</w:t>
             </w:r>
+            <w:bookmarkEnd w:id="1"/>
           </w:p>
         </w:tc>
         <w:tc>
@@ -6626,6 +7715,9 @@
         </w:tc>
       </w:tr>
       <w:tr>
+        <w:trPr>
+          <w:cantSplit w:val="false"/>
+        </w:trPr>
         <w:tc>
           <w:tcPr>
             <w:tcW w:type="dxa" w:w="1300"/>
@@ -6662,6 +7754,7 @@
             <w:pPr>
               <w:spacing w:after="60" w:before="0"/>
             </w:pPr>
+            <w:bookmarkStart w:name="i_essmath_1_3_031" w:id="1"/>
             <w:r>
               <w:rPr>
                 <w:rFonts w:ascii="Arial" w:cs="Arial" w:eastAsia="Arial" w:hAnsi="Arial"/>
@@ -6672,6 +7765,7 @@
               </w:rPr>
               <w:t xml:space="preserve">essmath_1_3-031</w:t>
             </w:r>
+            <w:bookmarkEnd w:id="1"/>
           </w:p>
         </w:tc>
         <w:tc>
@@ -7019,6 +8113,9 @@
         </w:tc>
       </w:tr>
       <w:tr>
+        <w:trPr>
+          <w:cantSplit w:val="false"/>
+        </w:trPr>
         <w:tc>
           <w:tcPr>
             <w:tcW w:type="dxa" w:w="1300"/>
@@ -7055,6 +8152,7 @@
             <w:pPr>
               <w:spacing w:after="60" w:before="0"/>
             </w:pPr>
+            <w:bookmarkStart w:name="i_essmath_1_3_032" w:id="1"/>
             <w:r>
               <w:rPr>
                 <w:rFonts w:ascii="Arial" w:cs="Arial" w:eastAsia="Arial" w:hAnsi="Arial"/>
@@ -7065,6 +8163,7 @@
               </w:rPr>
               <w:t xml:space="preserve">essmath_1_3-032</w:t>
             </w:r>
+            <w:bookmarkEnd w:id="1"/>
           </w:p>
         </w:tc>
         <w:tc>
@@ -7412,6 +8511,9 @@
         </w:tc>
       </w:tr>
       <w:tr>
+        <w:trPr>
+          <w:cantSplit w:val="false"/>
+        </w:trPr>
         <w:tc>
           <w:tcPr>
             <w:tcW w:type="dxa" w:w="1300"/>
@@ -7448,6 +8550,7 @@
             <w:pPr>
               <w:spacing w:after="60" w:before="0"/>
             </w:pPr>
+            <w:bookmarkStart w:name="i_essmath_1_3_033" w:id="1"/>
             <w:r>
               <w:rPr>
                 <w:rFonts w:ascii="Arial" w:cs="Arial" w:eastAsia="Arial" w:hAnsi="Arial"/>
@@ -7458,6 +8561,7 @@
               </w:rPr>
               <w:t xml:space="preserve">essmath_1_3-033</w:t>
             </w:r>
+            <w:bookmarkEnd w:id="1"/>
           </w:p>
         </w:tc>
         <w:tc>
@@ -7805,6 +8909,9 @@
         </w:tc>
       </w:tr>
       <w:tr>
+        <w:trPr>
+          <w:cantSplit w:val="false"/>
+        </w:trPr>
         <w:tc>
           <w:tcPr>
             <w:tcW w:type="dxa" w:w="1300"/>
@@ -7841,6 +8948,7 @@
             <w:pPr>
               <w:spacing w:after="60" w:before="0"/>
             </w:pPr>
+            <w:bookmarkStart w:name="i_essmath_1_3_G5" w:id="1"/>
             <w:r>
               <w:rPr>
                 <w:rFonts w:ascii="Arial" w:cs="Arial" w:eastAsia="Arial" w:hAnsi="Arial"/>
@@ -7851,6 +8959,7 @@
               </w:rPr>
               <w:t xml:space="preserve">essmath_1_3 G5 (group)</w:t>
             </w:r>
+            <w:bookmarkEnd w:id="1"/>
           </w:p>
           <w:p>
             <w:pPr>
@@ -8372,6 +9481,9 @@
         </w:tc>
       </w:tr>
       <w:tr>
+        <w:trPr>
+          <w:cantSplit w:val="false"/>
+        </w:trPr>
         <w:tc>
           <w:tcPr>
             <w:tcW w:type="dxa" w:w="1300"/>
@@ -8409,6 +9521,7 @@
             <w:pPr>
               <w:spacing w:after="60" w:before="0"/>
             </w:pPr>
+            <w:bookmarkStart w:name="i_essmath_1_3_G6" w:id="1"/>
             <w:r>
               <w:rPr>
                 <w:rFonts w:ascii="Arial" w:cs="Arial" w:eastAsia="Arial" w:hAnsi="Arial"/>
@@ -8419,6 +9532,7 @@
               </w:rPr>
               <w:t xml:space="preserve">essmath_1_3 G6 (group)</w:t>
             </w:r>
+            <w:bookmarkEnd w:id="1"/>
           </w:p>
           <w:p>
             <w:pPr>
@@ -8462,10 +9576,10 @@
                 <w:b/>
                 <w:bCs/>
                 <w:color w:val="C55A11"/>
-                <w:sz w:val="14"/>
-                <w:szCs w:val="14"/>
-              </w:rPr>
-              <w:t xml:space="preserve">TEACHER DECISION</w:t>
+                <w:sz w:val="16"/>
+                <w:szCs w:val="16"/>
+              </w:rPr>
+              <w:t xml:space="preserve">[DECISION] CHANGE PROPOSED: PLEASE CONFIRM</w:t>
             </w:r>
           </w:p>
         </w:tc>
@@ -9009,6 +10123,9 @@
         </w:tc>
       </w:tr>
       <w:tr>
+        <w:trPr>
+          <w:cantSplit w:val="false"/>
+        </w:trPr>
         <w:tc>
           <w:tcPr>
             <w:tcW w:type="dxa" w:w="1300"/>
@@ -9045,6 +10162,7 @@
             <w:pPr>
               <w:spacing w:after="60" w:before="0"/>
             </w:pPr>
+            <w:bookmarkStart w:name="i_essmath_1_3_G7" w:id="1"/>
             <w:r>
               <w:rPr>
                 <w:rFonts w:ascii="Arial" w:cs="Arial" w:eastAsia="Arial" w:hAnsi="Arial"/>
@@ -9055,6 +10173,7 @@
               </w:rPr>
               <w:t xml:space="preserve">essmath_1_3 G7 (group)</w:t>
             </w:r>
+            <w:bookmarkEnd w:id="1"/>
           </w:p>
           <w:p>
             <w:pPr>
@@ -9552,6 +10671,9 @@
         </w:tc>
       </w:tr>
       <w:tr>
+        <w:trPr>
+          <w:cantSplit w:val="false"/>
+        </w:trPr>
         <w:tc>
           <w:tcPr>
             <w:tcW w:type="dxa" w:w="1300"/>
@@ -9588,6 +10710,7 @@
             <w:pPr>
               <w:spacing w:after="60" w:before="0"/>
             </w:pPr>
+            <w:bookmarkStart w:name="i_essmath_1_3_G8" w:id="1"/>
             <w:r>
               <w:rPr>
                 <w:rFonts w:ascii="Arial" w:cs="Arial" w:eastAsia="Arial" w:hAnsi="Arial"/>
@@ -9598,6 +10721,7 @@
               </w:rPr>
               <w:t xml:space="preserve">essmath_1_3 G8 (group)</w:t>
             </w:r>
+            <w:bookmarkEnd w:id="1"/>
           </w:p>
           <w:p>
             <w:pPr>
@@ -10055,6 +11179,9 @@
         </w:tc>
       </w:tr>
       <w:tr>
+        <w:trPr>
+          <w:cantSplit w:val="false"/>
+        </w:trPr>
         <w:tc>
           <w:tcPr>
             <w:tcW w:type="dxa" w:w="1300"/>
@@ -10092,6 +11219,7 @@
             <w:pPr>
               <w:spacing w:after="60" w:before="0"/>
             </w:pPr>
+            <w:bookmarkStart w:name="i_essmath_1_3_G9" w:id="1"/>
             <w:r>
               <w:rPr>
                 <w:rFonts w:ascii="Arial" w:cs="Arial" w:eastAsia="Arial" w:hAnsi="Arial"/>
@@ -10102,6 +11230,7 @@
               </w:rPr>
               <w:t xml:space="preserve">essmath_1_3 G9 (group)</w:t>
             </w:r>
+            <w:bookmarkEnd w:id="1"/>
           </w:p>
           <w:p>
             <w:pPr>
@@ -10145,10 +11274,10 @@
                 <w:b/>
                 <w:bCs/>
                 <w:color w:val="C55A11"/>
-                <w:sz w:val="14"/>
-                <w:szCs w:val="14"/>
-              </w:rPr>
-              <w:t xml:space="preserve">TEACHER DECISION</w:t>
+                <w:sz w:val="16"/>
+                <w:szCs w:val="16"/>
+              </w:rPr>
+              <w:t xml:space="preserve">[DECISION] CHANGE PROPOSED: PLEASE CONFIRM</w:t>
             </w:r>
           </w:p>
         </w:tc>
@@ -10668,6 +11797,9 @@
         </w:tc>
       </w:tr>
       <w:tr>
+        <w:trPr>
+          <w:cantSplit w:val="false"/>
+        </w:trPr>
         <w:tc>
           <w:tcPr>
             <w:tcW w:type="dxa" w:w="1300"/>
@@ -10704,6 +11836,7 @@
             <w:pPr>
               <w:spacing w:after="60" w:before="0"/>
             </w:pPr>
+            <w:bookmarkStart w:name="i_essmath_1_3_059" w:id="1"/>
             <w:r>
               <w:rPr>
                 <w:rFonts w:ascii="Arial" w:cs="Arial" w:eastAsia="Arial" w:hAnsi="Arial"/>
@@ -10714,6 +11847,7 @@
               </w:rPr>
               <w:t xml:space="preserve">essmath_1_3-059</w:t>
             </w:r>
+            <w:bookmarkEnd w:id="1"/>
           </w:p>
         </w:tc>
         <w:tc>
@@ -11061,6 +12195,9 @@
         </w:tc>
       </w:tr>
       <w:tr>
+        <w:trPr>
+          <w:cantSplit w:val="false"/>
+        </w:trPr>
         <w:tc>
           <w:tcPr>
             <w:tcW w:type="dxa" w:w="1300"/>
@@ -11098,6 +12235,7 @@
             <w:pPr>
               <w:spacing w:after="60" w:before="0"/>
             </w:pPr>
+            <w:bookmarkStart w:name="i_essmath_1_3_G10" w:id="1"/>
             <w:r>
               <w:rPr>
                 <w:rFonts w:ascii="Arial" w:cs="Arial" w:eastAsia="Arial" w:hAnsi="Arial"/>
@@ -11108,6 +12246,7 @@
               </w:rPr>
               <w:t xml:space="preserve">essmath_1_3 G10 (group)</w:t>
             </w:r>
+            <w:bookmarkEnd w:id="1"/>
           </w:p>
           <w:p>
             <w:pPr>
@@ -11135,10 +12274,10 @@
                 <w:b/>
                 <w:bCs/>
                 <w:color w:val="C55A11"/>
-                <w:sz w:val="14"/>
-                <w:szCs w:val="14"/>
-              </w:rPr>
-              <w:t xml:space="preserve">TEACHER DECISION</w:t>
+                <w:sz w:val="16"/>
+                <w:szCs w:val="16"/>
+              </w:rPr>
+              <w:t xml:space="preserve">[DECISION] CHANGE PROPOSED: PLEASE CONFIRM</w:t>
             </w:r>
           </w:p>
         </w:tc>
@@ -11586,6 +12725,9 @@
         </w:tc>
       </w:tr>
       <w:tr>
+        <w:trPr>
+          <w:cantSplit w:val="false"/>
+        </w:trPr>
         <w:tc>
           <w:tcPr>
             <w:tcW w:type="dxa" w:w="1300"/>
@@ -11622,6 +12764,7 @@
             <w:pPr>
               <w:spacing w:after="60" w:before="0"/>
             </w:pPr>
+            <w:bookmarkStart w:name="i_essmath_1_3_063" w:id="1"/>
             <w:r>
               <w:rPr>
                 <w:rFonts w:ascii="Arial" w:cs="Arial" w:eastAsia="Arial" w:hAnsi="Arial"/>
@@ -11632,6 +12775,7 @@
               </w:rPr>
               <w:t xml:space="preserve">essmath_1_3-063</w:t>
             </w:r>
+            <w:bookmarkEnd w:id="1"/>
           </w:p>
         </w:tc>
         <w:tc>
@@ -11979,6 +13123,9 @@
         </w:tc>
       </w:tr>
       <w:tr>
+        <w:trPr>
+          <w:cantSplit w:val="false"/>
+        </w:trPr>
         <w:tc>
           <w:tcPr>
             <w:tcW w:type="dxa" w:w="1300"/>
@@ -12015,6 +13162,7 @@
             <w:pPr>
               <w:spacing w:after="60" w:before="0"/>
             </w:pPr>
+            <w:bookmarkStart w:name="i_essmath_1_3_G11" w:id="1"/>
             <w:r>
               <w:rPr>
                 <w:rFonts w:ascii="Arial" w:cs="Arial" w:eastAsia="Arial" w:hAnsi="Arial"/>
@@ -12025,6 +13173,7 @@
               </w:rPr>
               <w:t xml:space="preserve">essmath_1_3 G11 (group)</w:t>
             </w:r>
+            <w:bookmarkEnd w:id="1"/>
           </w:p>
           <w:p>
             <w:pPr>
@@ -12482,6 +13631,9 @@
         </w:tc>
       </w:tr>
       <w:tr>
+        <w:trPr>
+          <w:cantSplit w:val="false"/>
+        </w:trPr>
         <w:tc>
           <w:tcPr>
             <w:tcW w:type="dxa" w:w="1300"/>
@@ -12518,6 +13670,7 @@
             <w:pPr>
               <w:spacing w:after="60" w:before="0"/>
             </w:pPr>
+            <w:bookmarkStart w:name="i_essmath_1_3_067" w:id="1"/>
             <w:r>
               <w:rPr>
                 <w:rFonts w:ascii="Arial" w:cs="Arial" w:eastAsia="Arial" w:hAnsi="Arial"/>
@@ -12528,6 +13681,7 @@
               </w:rPr>
               <w:t xml:space="preserve">essmath_1_3-067</w:t>
             </w:r>
+            <w:bookmarkEnd w:id="1"/>
           </w:p>
         </w:tc>
         <w:tc>
@@ -12875,6 +14029,9 @@
         </w:tc>
       </w:tr>
       <w:tr>
+        <w:trPr>
+          <w:cantSplit w:val="false"/>
+        </w:trPr>
         <w:tc>
           <w:tcPr>
             <w:tcW w:type="dxa" w:w="1300"/>
@@ -12884,7 +14041,7 @@
               <w:bottom w:val="single" w:color="999999" w:sz="4"/>
               <w:right w:val="single" w:color="999999" w:sz="4"/>
             </w:tcBorders>
-            <w:shd w:fill="FFF2CC" w:color="auto" w:val="clear"/>
+            <w:shd w:fill="F8CBAD" w:color="auto" w:val="clear"/>
             <w:tcMar>
               <w:top w:type="dxa" w:w="50"/>
               <w:left w:type="dxa" w:w="80"/>
@@ -12912,6 +14069,7 @@
             <w:pPr>
               <w:spacing w:after="60" w:before="0"/>
             </w:pPr>
+            <w:bookmarkStart w:name="i_essmath_1_3_068" w:id="1"/>
             <w:r>
               <w:rPr>
                 <w:rFonts w:ascii="Arial" w:cs="Arial" w:eastAsia="Arial" w:hAnsi="Arial"/>
@@ -12922,6 +14080,7 @@
               </w:rPr>
               <w:t xml:space="preserve">essmath_1_3-068</w:t>
             </w:r>
+            <w:bookmarkEnd w:id="1"/>
           </w:p>
           <w:p>
             <w:pPr>
@@ -12948,27 +14107,11 @@
                 <w:rFonts w:ascii="Arial" w:cs="Arial" w:eastAsia="Arial" w:hAnsi="Arial"/>
                 <w:b/>
                 <w:bCs/>
-                <w:color w:val="C55A11"/>
-                <w:sz w:val="14"/>
-                <w:szCs w:val="14"/>
-              </w:rPr>
-              <w:t xml:space="preserve">TEACHER DECISION</w:t>
-            </w:r>
-          </w:p>
-          <w:p>
-            <w:pPr>
-              <w:spacing w:after="10" w:before="0"/>
-            </w:pPr>
-            <w:r>
-              <w:rPr>
-                <w:rFonts w:ascii="Arial" w:cs="Arial" w:eastAsia="Arial" w:hAnsi="Arial"/>
-                <w:b/>
-                <w:bCs/>
-                <w:color w:val="C55A11"/>
-                <w:sz w:val="14"/>
-                <w:szCs w:val="14"/>
-              </w:rPr>
-              <w:t xml:space="preserve">FLAG</w:t>
+                <w:color w:val="C00000"/>
+                <w:sz w:val="16"/>
+                <w:szCs w:val="16"/>
+              </w:rPr>
+              <w:t xml:space="preserve">[FLAG] NO CHANGE MADE: YOUR DECISION NEEDED</w:t>
             </w:r>
           </w:p>
         </w:tc>
@@ -12981,7 +14124,7 @@
               <w:bottom w:val="single" w:color="999999" w:sz="4"/>
               <w:right w:val="single" w:color="999999" w:sz="4"/>
             </w:tcBorders>
-            <w:shd w:fill="FFF2CC" w:color="auto" w:val="clear"/>
+            <w:shd w:fill="F8CBAD" w:color="auto" w:val="clear"/>
             <w:tcMar>
               <w:top w:type="dxa" w:w="50"/>
               <w:left w:type="dxa" w:w="80"/>
@@ -13027,7 +14170,7 @@
               <w:bottom w:val="single" w:color="999999" w:sz="4"/>
               <w:right w:val="single" w:color="999999" w:sz="4"/>
             </w:tcBorders>
-            <w:shd w:fill="FFF2CC" w:color="auto" w:val="clear"/>
+            <w:shd w:fill="F8CBAD" w:color="auto" w:val="clear"/>
             <w:tcMar>
               <w:top w:type="dxa" w:w="50"/>
               <w:left w:type="dxa" w:w="80"/>
@@ -13060,7 +14203,7 @@
               <w:bottom w:val="single" w:color="999999" w:sz="4"/>
               <w:right w:val="single" w:color="999999" w:sz="4"/>
             </w:tcBorders>
-            <w:shd w:fill="FFF2CC" w:color="auto" w:val="clear"/>
+            <w:shd w:fill="F8CBAD" w:color="auto" w:val="clear"/>
             <w:tcMar>
               <w:top w:type="dxa" w:w="50"/>
               <w:left w:type="dxa" w:w="80"/>
@@ -13107,7 +14250,7 @@
               <w:bottom w:val="single" w:color="999999" w:sz="4"/>
               <w:right w:val="single" w:color="999999" w:sz="4"/>
             </w:tcBorders>
-            <w:shd w:fill="FFF2CC" w:color="auto" w:val="clear"/>
+            <w:shd w:fill="F8CBAD" w:color="auto" w:val="clear"/>
             <w:tcMar>
               <w:top w:type="dxa" w:w="50"/>
               <w:left w:type="dxa" w:w="80"/>
@@ -13138,7 +14281,7 @@
               <w:bottom w:val="single" w:color="999999" w:sz="4"/>
               <w:right w:val="single" w:color="999999" w:sz="4"/>
             </w:tcBorders>
-            <w:shd w:fill="FFF2CC" w:color="auto" w:val="clear"/>
+            <w:shd w:fill="F8CBAD" w:color="auto" w:val="clear"/>
             <w:tcMar>
               <w:top w:type="dxa" w:w="50"/>
               <w:left w:type="dxa" w:w="80"/>
@@ -13275,6 +14418,9 @@
         </w:tc>
       </w:tr>
       <w:tr>
+        <w:trPr>
+          <w:cantSplit w:val="false"/>
+        </w:trPr>
         <w:tc>
           <w:tcPr>
             <w:tcW w:type="dxa" w:w="1300"/>
@@ -13284,7 +14430,7 @@
               <w:bottom w:val="single" w:color="999999" w:sz="4"/>
               <w:right w:val="single" w:color="999999" w:sz="4"/>
             </w:tcBorders>
-            <w:shd w:fill="FFF2CC" w:color="auto" w:val="clear"/>
+            <w:shd w:fill="F8CBAD" w:color="auto" w:val="clear"/>
             <w:tcMar>
               <w:top w:type="dxa" w:w="50"/>
               <w:left w:type="dxa" w:w="80"/>
@@ -13312,6 +14458,7 @@
             <w:pPr>
               <w:spacing w:after="60" w:before="0"/>
             </w:pPr>
+            <w:bookmarkStart w:name="i_essmath_1_3_069" w:id="1"/>
             <w:r>
               <w:rPr>
                 <w:rFonts w:ascii="Arial" w:cs="Arial" w:eastAsia="Arial" w:hAnsi="Arial"/>
@@ -13322,6 +14469,7 @@
               </w:rPr>
               <w:t xml:space="preserve">essmath_1_3-069</w:t>
             </w:r>
+            <w:bookmarkEnd w:id="1"/>
           </w:p>
           <w:p>
             <w:pPr>
@@ -13348,27 +14496,11 @@
                 <w:rFonts w:ascii="Arial" w:cs="Arial" w:eastAsia="Arial" w:hAnsi="Arial"/>
                 <w:b/>
                 <w:bCs/>
-                <w:color w:val="C55A11"/>
-                <w:sz w:val="14"/>
-                <w:szCs w:val="14"/>
-              </w:rPr>
-              <w:t xml:space="preserve">TEACHER DECISION</w:t>
-            </w:r>
-          </w:p>
-          <w:p>
-            <w:pPr>
-              <w:spacing w:after="10" w:before="0"/>
-            </w:pPr>
-            <w:r>
-              <w:rPr>
-                <w:rFonts w:ascii="Arial" w:cs="Arial" w:eastAsia="Arial" w:hAnsi="Arial"/>
-                <w:b/>
-                <w:bCs/>
-                <w:color w:val="C55A11"/>
-                <w:sz w:val="14"/>
-                <w:szCs w:val="14"/>
-              </w:rPr>
-              <w:t xml:space="preserve">FLAG</w:t>
+                <w:color w:val="C00000"/>
+                <w:sz w:val="16"/>
+                <w:szCs w:val="16"/>
+              </w:rPr>
+              <w:t xml:space="preserve">[FLAG] NO CHANGE MADE: YOUR DECISION NEEDED</w:t>
             </w:r>
           </w:p>
         </w:tc>
@@ -13381,7 +14513,7 @@
               <w:bottom w:val="single" w:color="999999" w:sz="4"/>
               <w:right w:val="single" w:color="999999" w:sz="4"/>
             </w:tcBorders>
-            <w:shd w:fill="FFF2CC" w:color="auto" w:val="clear"/>
+            <w:shd w:fill="F8CBAD" w:color="auto" w:val="clear"/>
             <w:tcMar>
               <w:top w:type="dxa" w:w="50"/>
               <w:left w:type="dxa" w:w="80"/>
@@ -13427,7 +14559,7 @@
               <w:bottom w:val="single" w:color="999999" w:sz="4"/>
               <w:right w:val="single" w:color="999999" w:sz="4"/>
             </w:tcBorders>
-            <w:shd w:fill="FFF2CC" w:color="auto" w:val="clear"/>
+            <w:shd w:fill="F8CBAD" w:color="auto" w:val="clear"/>
             <w:tcMar>
               <w:top w:type="dxa" w:w="50"/>
               <w:left w:type="dxa" w:w="80"/>
@@ -13460,7 +14592,7 @@
               <w:bottom w:val="single" w:color="999999" w:sz="4"/>
               <w:right w:val="single" w:color="999999" w:sz="4"/>
             </w:tcBorders>
-            <w:shd w:fill="FFF2CC" w:color="auto" w:val="clear"/>
+            <w:shd w:fill="F8CBAD" w:color="auto" w:val="clear"/>
             <w:tcMar>
               <w:top w:type="dxa" w:w="50"/>
               <w:left w:type="dxa" w:w="80"/>
@@ -13507,7 +14639,7 @@
               <w:bottom w:val="single" w:color="999999" w:sz="4"/>
               <w:right w:val="single" w:color="999999" w:sz="4"/>
             </w:tcBorders>
-            <w:shd w:fill="FFF2CC" w:color="auto" w:val="clear"/>
+            <w:shd w:fill="F8CBAD" w:color="auto" w:val="clear"/>
             <w:tcMar>
               <w:top w:type="dxa" w:w="50"/>
               <w:left w:type="dxa" w:w="80"/>
@@ -13538,7 +14670,7 @@
               <w:bottom w:val="single" w:color="999999" w:sz="4"/>
               <w:right w:val="single" w:color="999999" w:sz="4"/>
             </w:tcBorders>
-            <w:shd w:fill="FFF2CC" w:color="auto" w:val="clear"/>
+            <w:shd w:fill="F8CBAD" w:color="auto" w:val="clear"/>
             <w:tcMar>
               <w:top w:type="dxa" w:w="50"/>
               <w:left w:type="dxa" w:w="80"/>
@@ -13867,6 +14999,883 @@
         <w:t xml:space="preserve"/>
       </w:r>
     </w:p>
+    <w:p>
+      <w:pPr>
+        <w:keepNext/>
+        <w:spacing w:after="60" w:before="60"/>
+      </w:pPr>
+      <w:r>
+        <w:rPr>
+          <w:rFonts w:ascii="Arial" w:cs="Arial" w:eastAsia="Arial" w:hAnsi="Arial"/>
+          <w:b/>
+          <w:bCs/>
+          <w:color w:val="C00000"/>
+          <w:sz w:val="20"/>
+          <w:szCs w:val="20"/>
+        </w:rPr>
+        <w:t xml:space="preserve">Needs your attention: 5 items (2 [FLAG], 3 [DECISION])</w:t>
+      </w:r>
+    </w:p>
+    <w:tbl>
+      <w:tblPr>
+        <w:tblW w:type="dxa" w:w="13680"/>
+        <w:tblBorders>
+          <w:top w:val="single" w:color="auto" w:sz="4"/>
+          <w:left w:val="single" w:color="auto" w:sz="4"/>
+          <w:bottom w:val="single" w:color="auto" w:sz="4"/>
+          <w:right w:val="single" w:color="auto" w:sz="4"/>
+          <w:insideH w:val="single" w:color="auto" w:sz="4"/>
+          <w:insideV w:val="single" w:color="auto" w:sz="4"/>
+        </w:tblBorders>
+      </w:tblPr>
+      <w:tblGrid>
+        <w:gridCol w:w="2300"/>
+        <w:gridCol w:w="2300"/>
+        <w:gridCol w:w="3300"/>
+        <w:gridCol w:w="5780"/>
+      </w:tblGrid>
+      <w:tr>
+        <w:trPr>
+          <w:cantSplit/>
+          <w:tblHeader/>
+        </w:trPr>
+        <w:tc>
+          <w:tcPr>
+            <w:tcW w:type="dxa" w:w="2300"/>
+            <w:tcBorders>
+              <w:top w:val="single" w:color="999999" w:sz="4"/>
+              <w:left w:val="single" w:color="999999" w:sz="4"/>
+              <w:bottom w:val="single" w:color="999999" w:sz="4"/>
+              <w:right w:val="single" w:color="999999" w:sz="4"/>
+            </w:tcBorders>
+            <w:shd w:fill="D5E8F0" w:color="auto" w:val="clear"/>
+            <w:tcMar>
+              <w:top w:type="dxa" w:w="50"/>
+              <w:left w:type="dxa" w:w="80"/>
+              <w:bottom w:type="dxa" w:w="50"/>
+              <w:right w:type="dxa" w:w="80"/>
+            </w:tcMar>
+          </w:tcPr>
+          <w:p>
+            <w:pPr>
+              <w:spacing w:after="60" w:before="0"/>
+            </w:pPr>
+            <w:r>
+              <w:rPr>
+                <w:rFonts w:ascii="Arial" w:cs="Arial" w:eastAsia="Arial" w:hAnsi="Arial"/>
+                <w:b/>
+                <w:bCs/>
+                <w:sz w:val="17"/>
+                <w:szCs w:val="17"/>
+              </w:rPr>
+              <w:t xml:space="preserve">Item (click to jump)</w:t>
+            </w:r>
+          </w:p>
+        </w:tc>
+        <w:tc>
+          <w:tcPr>
+            <w:tcW w:type="dxa" w:w="2300"/>
+            <w:tcBorders>
+              <w:top w:val="single" w:color="999999" w:sz="4"/>
+              <w:left w:val="single" w:color="999999" w:sz="4"/>
+              <w:bottom w:val="single" w:color="999999" w:sz="4"/>
+              <w:right w:val="single" w:color="999999" w:sz="4"/>
+            </w:tcBorders>
+            <w:shd w:fill="D5E8F0" w:color="auto" w:val="clear"/>
+            <w:tcMar>
+              <w:top w:type="dxa" w:w="50"/>
+              <w:left w:type="dxa" w:w="80"/>
+              <w:bottom w:type="dxa" w:w="50"/>
+              <w:right w:type="dxa" w:w="80"/>
+            </w:tcMar>
+          </w:tcPr>
+          <w:p>
+            <w:pPr>
+              <w:spacing w:after="60" w:before="0"/>
+            </w:pPr>
+            <w:r>
+              <w:rPr>
+                <w:rFonts w:ascii="Arial" w:cs="Arial" w:eastAsia="Arial" w:hAnsi="Arial"/>
+                <w:b/>
+                <w:bCs/>
+                <w:sz w:val="17"/>
+                <w:szCs w:val="17"/>
+              </w:rPr>
+              <w:t xml:space="preserve">Type</w:t>
+            </w:r>
+          </w:p>
+        </w:tc>
+        <w:tc>
+          <w:tcPr>
+            <w:tcW w:type="dxa" w:w="3300"/>
+            <w:tcBorders>
+              <w:top w:val="single" w:color="999999" w:sz="4"/>
+              <w:left w:val="single" w:color="999999" w:sz="4"/>
+              <w:bottom w:val="single" w:color="999999" w:sz="4"/>
+              <w:right w:val="single" w:color="999999" w:sz="4"/>
+            </w:tcBorders>
+            <w:shd w:fill="D5E8F0" w:color="auto" w:val="clear"/>
+            <w:tcMar>
+              <w:top w:type="dxa" w:w="50"/>
+              <w:left w:type="dxa" w:w="80"/>
+              <w:bottom w:type="dxa" w:w="50"/>
+              <w:right w:type="dxa" w:w="80"/>
+            </w:tcMar>
+          </w:tcPr>
+          <w:p>
+            <w:pPr>
+              <w:spacing w:after="60" w:before="0"/>
+            </w:pPr>
+            <w:r>
+              <w:rPr>
+                <w:rFonts w:ascii="Arial" w:cs="Arial" w:eastAsia="Arial" w:hAnsi="Arial"/>
+                <w:b/>
+                <w:bCs/>
+                <w:sz w:val="17"/>
+                <w:szCs w:val="17"/>
+              </w:rPr>
+              <w:t xml:space="preserve">Where</w:t>
+            </w:r>
+          </w:p>
+        </w:tc>
+        <w:tc>
+          <w:tcPr>
+            <w:tcW w:type="dxa" w:w="5780"/>
+            <w:tcBorders>
+              <w:top w:val="single" w:color="999999" w:sz="4"/>
+              <w:left w:val="single" w:color="999999" w:sz="4"/>
+              <w:bottom w:val="single" w:color="999999" w:sz="4"/>
+              <w:right w:val="single" w:color="999999" w:sz="4"/>
+            </w:tcBorders>
+            <w:shd w:fill="D5E8F0" w:color="auto" w:val="clear"/>
+            <w:tcMar>
+              <w:top w:type="dxa" w:w="50"/>
+              <w:left w:type="dxa" w:w="80"/>
+              <w:bottom w:type="dxa" w:w="50"/>
+              <w:right w:type="dxa" w:w="80"/>
+            </w:tcMar>
+          </w:tcPr>
+          <w:p>
+            <w:pPr>
+              <w:spacing w:after="60" w:before="0"/>
+            </w:pPr>
+            <w:r>
+              <w:rPr>
+                <w:rFonts w:ascii="Arial" w:cs="Arial" w:eastAsia="Arial" w:hAnsi="Arial"/>
+                <w:b/>
+                <w:bCs/>
+                <w:sz w:val="17"/>
+                <w:szCs w:val="17"/>
+              </w:rPr>
+              <w:t xml:space="preserve">What</w:t>
+            </w:r>
+          </w:p>
+        </w:tc>
+      </w:tr>
+      <w:tr>
+        <w:trPr>
+          <w:cantSplit/>
+        </w:trPr>
+        <w:tc>
+          <w:tcPr>
+            <w:tcW w:type="dxa" w:w="2300"/>
+            <w:tcBorders>
+              <w:top w:val="single" w:color="999999" w:sz="4"/>
+              <w:left w:val="single" w:color="999999" w:sz="4"/>
+              <w:bottom w:val="single" w:color="999999" w:sz="4"/>
+              <w:right w:val="single" w:color="999999" w:sz="4"/>
+            </w:tcBorders>
+            <w:shd w:fill="FFF2CC" w:color="auto" w:val="clear"/>
+            <w:tcMar>
+              <w:top w:type="dxa" w:w="50"/>
+              <w:left w:type="dxa" w:w="80"/>
+              <w:bottom w:type="dxa" w:w="50"/>
+              <w:right w:type="dxa" w:w="80"/>
+            </w:tcMar>
+          </w:tcPr>
+          <w:p>
+            <w:pPr>
+              <w:spacing w:after="40"/>
+            </w:pPr>
+            <w:hyperlink w:history="1" w:anchor="i_essmath_2_1_G3">
+              <w:r>
+                <w:rPr>
+                  <w:rFonts w:ascii="Arial" w:cs="Arial" w:eastAsia="Arial" w:hAnsi="Arial"/>
+                  <w:b/>
+                  <w:bCs/>
+                  <w:color w:val="0563C1"/>
+                  <w:sz w:val="17"/>
+                  <w:szCs w:val="17"/>
+                  <w:u w:val="single"/>
+                </w:rPr>
+                <w:t xml:space="preserve">essmath_2_1 G3</w:t>
+              </w:r>
+            </w:hyperlink>
+          </w:p>
+        </w:tc>
+        <w:tc>
+          <w:tcPr>
+            <w:tcW w:type="dxa" w:w="2300"/>
+            <w:tcBorders>
+              <w:top w:val="single" w:color="999999" w:sz="4"/>
+              <w:left w:val="single" w:color="999999" w:sz="4"/>
+              <w:bottom w:val="single" w:color="999999" w:sz="4"/>
+              <w:right w:val="single" w:color="999999" w:sz="4"/>
+            </w:tcBorders>
+            <w:shd w:fill="FFF2CC" w:color="auto" w:val="clear"/>
+            <w:tcMar>
+              <w:top w:type="dxa" w:w="50"/>
+              <w:left w:type="dxa" w:w="80"/>
+              <w:bottom w:type="dxa" w:w="50"/>
+              <w:right w:type="dxa" w:w="80"/>
+            </w:tcMar>
+          </w:tcPr>
+          <w:p>
+            <w:pPr>
+              <w:spacing w:after="60" w:before="0"/>
+            </w:pPr>
+            <w:r>
+              <w:rPr>
+                <w:rFonts w:ascii="Arial" w:cs="Arial" w:eastAsia="Arial" w:hAnsi="Arial"/>
+                <w:b/>
+                <w:bCs/>
+                <w:color w:val="C55A11"/>
+                <w:sz w:val="17"/>
+                <w:szCs w:val="17"/>
+              </w:rPr>
+              <w:t xml:space="preserve">[DECISION] change proposed</w:t>
+            </w:r>
+          </w:p>
+        </w:tc>
+        <w:tc>
+          <w:tcPr>
+            <w:tcW w:type="dxa" w:w="3300"/>
+            <w:tcBorders>
+              <w:top w:val="single" w:color="999999" w:sz="4"/>
+              <w:left w:val="single" w:color="999999" w:sz="4"/>
+              <w:bottom w:val="single" w:color="999999" w:sz="4"/>
+              <w:right w:val="single" w:color="999999" w:sz="4"/>
+            </w:tcBorders>
+            <w:shd w:fill="FFF2CC" w:color="auto" w:val="clear"/>
+            <w:tcMar>
+              <w:top w:type="dxa" w:w="50"/>
+              <w:left w:type="dxa" w:w="80"/>
+              <w:bottom w:type="dxa" w:w="50"/>
+              <w:right w:type="dxa" w:w="80"/>
+            </w:tcMar>
+          </w:tcPr>
+          <w:p>
+            <w:pPr>
+              <w:spacing w:after="60" w:before="0"/>
+            </w:pPr>
+            <w:r>
+              <w:rPr>
+                <w:rFonts w:ascii="Arial" w:cs="Arial" w:eastAsia="Arial" w:hAnsi="Arial"/>
+                <w:sz w:val="17"/>
+                <w:szCs w:val="17"/>
+              </w:rPr>
+              <w:t xml:space="preserve">Lesson 8, Observe Phase, learnerExperience</w:t>
+            </w:r>
+          </w:p>
+        </w:tc>
+        <w:tc>
+          <w:tcPr>
+            <w:tcW w:type="dxa" w:w="5780"/>
+            <w:tcBorders>
+              <w:top w:val="single" w:color="999999" w:sz="4"/>
+              <w:left w:val="single" w:color="999999" w:sz="4"/>
+              <w:bottom w:val="single" w:color="999999" w:sz="4"/>
+              <w:right w:val="single" w:color="999999" w:sz="4"/>
+            </w:tcBorders>
+            <w:shd w:fill="FFF2CC" w:color="auto" w:val="clear"/>
+            <w:tcMar>
+              <w:top w:type="dxa" w:w="50"/>
+              <w:left w:type="dxa" w:w="80"/>
+              <w:bottom w:type="dxa" w:w="50"/>
+              <w:right w:type="dxa" w:w="80"/>
+            </w:tcMar>
+          </w:tcPr>
+          <w:p>
+            <w:pPr>
+              <w:spacing w:after="60" w:before="0"/>
+            </w:pPr>
+            <w:r>
+              <w:rPr>
+                <w:rFonts w:ascii="Arial" w:cs="Arial" w:eastAsia="Arial" w:hAnsi="Arial"/>
+                <w:sz w:val="17"/>
+                <w:szCs w:val="17"/>
+              </w:rPr>
+              <w:t xml:space="preserve">Building two similar containers from scratch, filling them and filming the steps cannot be done in 35 minutes in a large class; builds now start from ready-made or pre-made containers. Planning, measuring, cutting, assembling two containers, calculating, fill…</w:t>
+            </w:r>
+          </w:p>
+        </w:tc>
+      </w:tr>
+      <w:tr>
+        <w:trPr>
+          <w:cantSplit/>
+        </w:trPr>
+        <w:tc>
+          <w:tcPr>
+            <w:tcW w:type="dxa" w:w="2300"/>
+            <w:tcBorders>
+              <w:top w:val="single" w:color="999999" w:sz="4"/>
+              <w:left w:val="single" w:color="999999" w:sz="4"/>
+              <w:bottom w:val="single" w:color="999999" w:sz="4"/>
+              <w:right w:val="single" w:color="999999" w:sz="4"/>
+            </w:tcBorders>
+            <w:shd w:fill="FFF2CC" w:color="auto" w:val="clear"/>
+            <w:tcMar>
+              <w:top w:type="dxa" w:w="50"/>
+              <w:left w:type="dxa" w:w="80"/>
+              <w:bottom w:type="dxa" w:w="50"/>
+              <w:right w:type="dxa" w:w="80"/>
+            </w:tcMar>
+          </w:tcPr>
+          <w:p>
+            <w:pPr>
+              <w:spacing w:after="40"/>
+            </w:pPr>
+            <w:hyperlink w:history="1" w:anchor="i_essmath_2_1_022">
+              <w:r>
+                <w:rPr>
+                  <w:rFonts w:ascii="Arial" w:cs="Arial" w:eastAsia="Arial" w:hAnsi="Arial"/>
+                  <w:b/>
+                  <w:bCs/>
+                  <w:color w:val="0563C1"/>
+                  <w:sz w:val="17"/>
+                  <w:szCs w:val="17"/>
+                  <w:u w:val="single"/>
+                </w:rPr>
+                <w:t xml:space="preserve">essmath_2_1-022</w:t>
+              </w:r>
+            </w:hyperlink>
+          </w:p>
+        </w:tc>
+        <w:tc>
+          <w:tcPr>
+            <w:tcW w:type="dxa" w:w="2300"/>
+            <w:tcBorders>
+              <w:top w:val="single" w:color="999999" w:sz="4"/>
+              <w:left w:val="single" w:color="999999" w:sz="4"/>
+              <w:bottom w:val="single" w:color="999999" w:sz="4"/>
+              <w:right w:val="single" w:color="999999" w:sz="4"/>
+            </w:tcBorders>
+            <w:shd w:fill="FFF2CC" w:color="auto" w:val="clear"/>
+            <w:tcMar>
+              <w:top w:type="dxa" w:w="50"/>
+              <w:left w:type="dxa" w:w="80"/>
+              <w:bottom w:type="dxa" w:w="50"/>
+              <w:right w:type="dxa" w:w="80"/>
+            </w:tcMar>
+          </w:tcPr>
+          <w:p>
+            <w:pPr>
+              <w:spacing w:after="60" w:before="0"/>
+            </w:pPr>
+            <w:r>
+              <w:rPr>
+                <w:rFonts w:ascii="Arial" w:cs="Arial" w:eastAsia="Arial" w:hAnsi="Arial"/>
+                <w:b/>
+                <w:bCs/>
+                <w:color w:val="C55A11"/>
+                <w:sz w:val="17"/>
+                <w:szCs w:val="17"/>
+              </w:rPr>
+              <w:t xml:space="preserve">[DECISION] change proposed</w:t>
+            </w:r>
+          </w:p>
+        </w:tc>
+        <w:tc>
+          <w:tcPr>
+            <w:tcW w:type="dxa" w:w="3300"/>
+            <w:tcBorders>
+              <w:top w:val="single" w:color="999999" w:sz="4"/>
+              <w:left w:val="single" w:color="999999" w:sz="4"/>
+              <w:bottom w:val="single" w:color="999999" w:sz="4"/>
+              <w:right w:val="single" w:color="999999" w:sz="4"/>
+            </w:tcBorders>
+            <w:shd w:fill="FFF2CC" w:color="auto" w:val="clear"/>
+            <w:tcMar>
+              <w:top w:type="dxa" w:w="50"/>
+              <w:left w:type="dxa" w:w="80"/>
+              <w:bottom w:type="dxa" w:w="50"/>
+              <w:right w:type="dxa" w:w="80"/>
+            </w:tcMar>
+          </w:tcPr>
+          <w:p>
+            <w:pPr>
+              <w:spacing w:after="60" w:before="0"/>
+            </w:pPr>
+            <w:r>
+              <w:rPr>
+                <w:rFonts w:ascii="Arial" w:cs="Arial" w:eastAsia="Arial" w:hAnsi="Arial"/>
+                <w:sz w:val="17"/>
+                <w:szCs w:val="17"/>
+              </w:rPr>
+              <w:t xml:space="preserve">Unit overview, phenomenon</w:t>
+            </w:r>
+          </w:p>
+        </w:tc>
+        <w:tc>
+          <w:tcPr>
+            <w:tcW w:type="dxa" w:w="5780"/>
+            <w:tcBorders>
+              <w:top w:val="single" w:color="999999" w:sz="4"/>
+              <w:left w:val="single" w:color="999999" w:sz="4"/>
+              <w:bottom w:val="single" w:color="999999" w:sz="4"/>
+              <w:right w:val="single" w:color="999999" w:sz="4"/>
+            </w:tcBorders>
+            <w:shd w:fill="FFF2CC" w:color="auto" w:val="clear"/>
+            <w:tcMar>
+              <w:top w:type="dxa" w:w="50"/>
+              <w:left w:type="dxa" w:w="80"/>
+              <w:bottom w:type="dxa" w:w="50"/>
+              <w:right w:type="dxa" w:w="80"/>
+            </w:tcMar>
+          </w:tcPr>
+          <w:p>
+            <w:pPr>
+              <w:spacing w:after="60" w:before="0"/>
+            </w:pPr>
+            <w:r>
+              <w:rPr>
+                <w:rFonts w:ascii="Arial" w:cs="Arial" w:eastAsia="Arial" w:hAnsi="Arial"/>
+                <w:sz w:val="17"/>
+                <w:szCs w:val="17"/>
+              </w:rPr>
+              <w:t xml:space="preserve">The unit phenomenon says 'cooking oil used to paint', but every lesson (and the safety notes) says oil paint for the outside of the sufuria. Wording aligned to the lessons; teacher confirms that oil paint is the intended story.</w:t>
+            </w:r>
+          </w:p>
+        </w:tc>
+      </w:tr>
+      <w:tr>
+        <w:trPr>
+          <w:cantSplit/>
+        </w:trPr>
+        <w:tc>
+          <w:tcPr>
+            <w:tcW w:type="dxa" w:w="2300"/>
+            <w:tcBorders>
+              <w:top w:val="single" w:color="999999" w:sz="4"/>
+              <w:left w:val="single" w:color="999999" w:sz="4"/>
+              <w:bottom w:val="single" w:color="999999" w:sz="4"/>
+              <w:right w:val="single" w:color="999999" w:sz="4"/>
+            </w:tcBorders>
+            <w:shd w:fill="FFF2CC" w:color="auto" w:val="clear"/>
+            <w:tcMar>
+              <w:top w:type="dxa" w:w="50"/>
+              <w:left w:type="dxa" w:w="80"/>
+              <w:bottom w:type="dxa" w:w="50"/>
+              <w:right w:type="dxa" w:w="80"/>
+            </w:tcMar>
+          </w:tcPr>
+          <w:p>
+            <w:pPr>
+              <w:spacing w:after="40"/>
+            </w:pPr>
+            <w:hyperlink w:history="1" w:anchor="i_essmath_2_1_G14">
+              <w:r>
+                <w:rPr>
+                  <w:rFonts w:ascii="Arial" w:cs="Arial" w:eastAsia="Arial" w:hAnsi="Arial"/>
+                  <w:b/>
+                  <w:bCs/>
+                  <w:color w:val="0563C1"/>
+                  <w:sz w:val="17"/>
+                  <w:szCs w:val="17"/>
+                  <w:u w:val="single"/>
+                </w:rPr>
+                <w:t xml:space="preserve">essmath_2_1 G14</w:t>
+              </w:r>
+            </w:hyperlink>
+          </w:p>
+        </w:tc>
+        <w:tc>
+          <w:tcPr>
+            <w:tcW w:type="dxa" w:w="2300"/>
+            <w:tcBorders>
+              <w:top w:val="single" w:color="999999" w:sz="4"/>
+              <w:left w:val="single" w:color="999999" w:sz="4"/>
+              <w:bottom w:val="single" w:color="999999" w:sz="4"/>
+              <w:right w:val="single" w:color="999999" w:sz="4"/>
+            </w:tcBorders>
+            <w:shd w:fill="FFF2CC" w:color="auto" w:val="clear"/>
+            <w:tcMar>
+              <w:top w:type="dxa" w:w="50"/>
+              <w:left w:type="dxa" w:w="80"/>
+              <w:bottom w:type="dxa" w:w="50"/>
+              <w:right w:type="dxa" w:w="80"/>
+            </w:tcMar>
+          </w:tcPr>
+          <w:p>
+            <w:pPr>
+              <w:spacing w:after="60" w:before="0"/>
+            </w:pPr>
+            <w:r>
+              <w:rPr>
+                <w:rFonts w:ascii="Arial" w:cs="Arial" w:eastAsia="Arial" w:hAnsi="Arial"/>
+                <w:b/>
+                <w:bCs/>
+                <w:color w:val="C55A11"/>
+                <w:sz w:val="17"/>
+                <w:szCs w:val="17"/>
+              </w:rPr>
+              <w:t xml:space="preserve">[DECISION] change proposed</w:t>
+            </w:r>
+          </w:p>
+        </w:tc>
+        <w:tc>
+          <w:tcPr>
+            <w:tcW w:type="dxa" w:w="3300"/>
+            <w:tcBorders>
+              <w:top w:val="single" w:color="999999" w:sz="4"/>
+              <w:left w:val="single" w:color="999999" w:sz="4"/>
+              <w:bottom w:val="single" w:color="999999" w:sz="4"/>
+              <w:right w:val="single" w:color="999999" w:sz="4"/>
+            </w:tcBorders>
+            <w:shd w:fill="FFF2CC" w:color="auto" w:val="clear"/>
+            <w:tcMar>
+              <w:top w:type="dxa" w:w="50"/>
+              <w:left w:type="dxa" w:w="80"/>
+              <w:bottom w:type="dxa" w:w="50"/>
+              <w:right w:type="dxa" w:w="80"/>
+            </w:tcMar>
+          </w:tcPr>
+          <w:p>
+            <w:pPr>
+              <w:spacing w:after="60" w:before="0"/>
+            </w:pPr>
+            <w:r>
+              <w:rPr>
+                <w:rFonts w:ascii="Arial" w:cs="Arial" w:eastAsia="Arial" w:hAnsi="Arial"/>
+                <w:sz w:val="17"/>
+                <w:szCs w:val="17"/>
+              </w:rPr>
+              <w:t xml:space="preserve">Lesson 2, Explain Phase, teacherMoves</w:t>
+            </w:r>
+          </w:p>
+        </w:tc>
+        <w:tc>
+          <w:tcPr>
+            <w:tcW w:type="dxa" w:w="5780"/>
+            <w:tcBorders>
+              <w:top w:val="single" w:color="999999" w:sz="4"/>
+              <w:left w:val="single" w:color="999999" w:sz="4"/>
+              <w:bottom w:val="single" w:color="999999" w:sz="4"/>
+              <w:right w:val="single" w:color="999999" w:sz="4"/>
+            </w:tcBorders>
+            <w:shd w:fill="FFF2CC" w:color="auto" w:val="clear"/>
+            <w:tcMar>
+              <w:top w:type="dxa" w:w="50"/>
+              <w:left w:type="dxa" w:w="80"/>
+              <w:bottom w:type="dxa" w:w="50"/>
+              <w:right w:type="dxa" w:w="80"/>
+            </w:tcMar>
+          </w:tcPr>
+          <w:p>
+            <w:pPr>
+              <w:spacing w:after="60" w:before="0"/>
+            </w:pPr>
+            <w:r>
+              <w:rPr>
+                <w:rFonts w:ascii="Arial" w:cs="Arial" w:eastAsia="Arial" w:hAnsi="Arial"/>
+                <w:sz w:val="17"/>
+                <w:szCs w:val="17"/>
+              </w:rPr>
+              <w:t xml:space="preserve">Kiswahili support for key terms added in four lessons (suggested wording, teachers to confirm local usage). No Kiswahili support existed anywhere in the unit. I suggest common school terms but cannot verify local or textbook usage; the teacher must confirm or…</w:t>
+            </w:r>
+          </w:p>
+        </w:tc>
+      </w:tr>
+      <w:tr>
+        <w:trPr>
+          <w:cantSplit/>
+        </w:trPr>
+        <w:tc>
+          <w:tcPr>
+            <w:tcW w:type="dxa" w:w="2300"/>
+            <w:tcBorders>
+              <w:top w:val="single" w:color="999999" w:sz="4"/>
+              <w:left w:val="single" w:color="999999" w:sz="4"/>
+              <w:bottom w:val="single" w:color="999999" w:sz="4"/>
+              <w:right w:val="single" w:color="999999" w:sz="4"/>
+            </w:tcBorders>
+            <w:shd w:fill="F8CBAD" w:color="auto" w:val="clear"/>
+            <w:tcMar>
+              <w:top w:type="dxa" w:w="50"/>
+              <w:left w:type="dxa" w:w="80"/>
+              <w:bottom w:type="dxa" w:w="50"/>
+              <w:right w:type="dxa" w:w="80"/>
+            </w:tcMar>
+          </w:tcPr>
+          <w:p>
+            <w:pPr>
+              <w:spacing w:after="40"/>
+            </w:pPr>
+            <w:hyperlink w:history="1" w:anchor="i_essmath_2_1_034">
+              <w:r>
+                <w:rPr>
+                  <w:rFonts w:ascii="Arial" w:cs="Arial" w:eastAsia="Arial" w:hAnsi="Arial"/>
+                  <w:b/>
+                  <w:bCs/>
+                  <w:color w:val="0563C1"/>
+                  <w:sz w:val="17"/>
+                  <w:szCs w:val="17"/>
+                  <w:u w:val="single"/>
+                </w:rPr>
+                <w:t xml:space="preserve">essmath_2_1-034</w:t>
+              </w:r>
+            </w:hyperlink>
+          </w:p>
+        </w:tc>
+        <w:tc>
+          <w:tcPr>
+            <w:tcW w:type="dxa" w:w="2300"/>
+            <w:tcBorders>
+              <w:top w:val="single" w:color="999999" w:sz="4"/>
+              <w:left w:val="single" w:color="999999" w:sz="4"/>
+              <w:bottom w:val="single" w:color="999999" w:sz="4"/>
+              <w:right w:val="single" w:color="999999" w:sz="4"/>
+            </w:tcBorders>
+            <w:shd w:fill="F8CBAD" w:color="auto" w:val="clear"/>
+            <w:tcMar>
+              <w:top w:type="dxa" w:w="50"/>
+              <w:left w:type="dxa" w:w="80"/>
+              <w:bottom w:type="dxa" w:w="50"/>
+              <w:right w:type="dxa" w:w="80"/>
+            </w:tcMar>
+          </w:tcPr>
+          <w:p>
+            <w:pPr>
+              <w:spacing w:after="60" w:before="0"/>
+            </w:pPr>
+            <w:r>
+              <w:rPr>
+                <w:rFonts w:ascii="Arial" w:cs="Arial" w:eastAsia="Arial" w:hAnsi="Arial"/>
+                <w:b/>
+                <w:bCs/>
+                <w:color w:val="C00000"/>
+                <w:sz w:val="17"/>
+                <w:szCs w:val="17"/>
+              </w:rPr>
+              <w:t xml:space="preserve">[FLAG] no change made</w:t>
+            </w:r>
+          </w:p>
+        </w:tc>
+        <w:tc>
+          <w:tcPr>
+            <w:tcW w:type="dxa" w:w="3300"/>
+            <w:tcBorders>
+              <w:top w:val="single" w:color="999999" w:sz="4"/>
+              <w:left w:val="single" w:color="999999" w:sz="4"/>
+              <w:bottom w:val="single" w:color="999999" w:sz="4"/>
+              <w:right w:val="single" w:color="999999" w:sz="4"/>
+            </w:tcBorders>
+            <w:shd w:fill="F8CBAD" w:color="auto" w:val="clear"/>
+            <w:tcMar>
+              <w:top w:type="dxa" w:w="50"/>
+              <w:left w:type="dxa" w:w="80"/>
+              <w:bottom w:type="dxa" w:w="50"/>
+              <w:right w:type="dxa" w:w="80"/>
+            </w:tcMar>
+          </w:tcPr>
+          <w:p>
+            <w:pPr>
+              <w:spacing w:after="60" w:before="0"/>
+            </w:pPr>
+            <w:r>
+              <w:rPr>
+                <w:rFonts w:ascii="Arial" w:cs="Arial" w:eastAsia="Arial" w:hAnsi="Arial"/>
+                <w:sz w:val="17"/>
+                <w:szCs w:val="17"/>
+              </w:rPr>
+              <w:t xml:space="preserve">Final Explanation, rubric</w:t>
+            </w:r>
+          </w:p>
+        </w:tc>
+        <w:tc>
+          <w:tcPr>
+            <w:tcW w:type="dxa" w:w="5780"/>
+            <w:tcBorders>
+              <w:top w:val="single" w:color="999999" w:sz="4"/>
+              <w:left w:val="single" w:color="999999" w:sz="4"/>
+              <w:bottom w:val="single" w:color="999999" w:sz="4"/>
+              <w:right w:val="single" w:color="999999" w:sz="4"/>
+            </w:tcBorders>
+            <w:shd w:fill="F8CBAD" w:color="auto" w:val="clear"/>
+            <w:tcMar>
+              <w:top w:type="dxa" w:w="50"/>
+              <w:left w:type="dxa" w:w="80"/>
+              <w:bottom w:type="dxa" w:w="50"/>
+              <w:right w:type="dxa" w:w="80"/>
+            </w:tcMar>
+          </w:tcPr>
+          <w:p>
+            <w:pPr>
+              <w:spacing w:after="60" w:before="0"/>
+            </w:pPr>
+            <w:r>
+              <w:rPr>
+                <w:rFonts w:ascii="Arial" w:cs="Arial" w:eastAsia="Arial" w:hAnsi="Arial"/>
+                <w:sz w:val="17"/>
+                <w:szCs w:val="17"/>
+              </w:rPr>
+              <w:t xml:space="preserve">CBE uses four levels (Exceeds, Meets, Approaches, Below Expectations) but the partner contract allows only three level fields and the printed headings are fixed by the template, so a Below Expectations level cannot be represented. Suggestion: teachers treat w…</w:t>
+            </w:r>
+          </w:p>
+        </w:tc>
+      </w:tr>
+      <w:tr>
+        <w:trPr>
+          <w:cantSplit/>
+        </w:trPr>
+        <w:tc>
+          <w:tcPr>
+            <w:tcW w:type="dxa" w:w="2300"/>
+            <w:tcBorders>
+              <w:top w:val="single" w:color="999999" w:sz="4"/>
+              <w:left w:val="single" w:color="999999" w:sz="4"/>
+              <w:bottom w:val="single" w:color="999999" w:sz="4"/>
+              <w:right w:val="single" w:color="999999" w:sz="4"/>
+            </w:tcBorders>
+            <w:shd w:fill="F8CBAD" w:color="auto" w:val="clear"/>
+            <w:tcMar>
+              <w:top w:type="dxa" w:w="50"/>
+              <w:left w:type="dxa" w:w="80"/>
+              <w:bottom w:type="dxa" w:w="50"/>
+              <w:right w:type="dxa" w:w="80"/>
+            </w:tcMar>
+          </w:tcPr>
+          <w:p>
+            <w:pPr>
+              <w:spacing w:after="40"/>
+            </w:pPr>
+            <w:hyperlink w:history="1" w:anchor="i_essmath_2_1_035">
+              <w:r>
+                <w:rPr>
+                  <w:rFonts w:ascii="Arial" w:cs="Arial" w:eastAsia="Arial" w:hAnsi="Arial"/>
+                  <w:b/>
+                  <w:bCs/>
+                  <w:color w:val="0563C1"/>
+                  <w:sz w:val="17"/>
+                  <w:szCs w:val="17"/>
+                  <w:u w:val="single"/>
+                </w:rPr>
+                <w:t xml:space="preserve">essmath_2_1-035</w:t>
+              </w:r>
+            </w:hyperlink>
+          </w:p>
+        </w:tc>
+        <w:tc>
+          <w:tcPr>
+            <w:tcW w:type="dxa" w:w="2300"/>
+            <w:tcBorders>
+              <w:top w:val="single" w:color="999999" w:sz="4"/>
+              <w:left w:val="single" w:color="999999" w:sz="4"/>
+              <w:bottom w:val="single" w:color="999999" w:sz="4"/>
+              <w:right w:val="single" w:color="999999" w:sz="4"/>
+            </w:tcBorders>
+            <w:shd w:fill="F8CBAD" w:color="auto" w:val="clear"/>
+            <w:tcMar>
+              <w:top w:type="dxa" w:w="50"/>
+              <w:left w:type="dxa" w:w="80"/>
+              <w:bottom w:type="dxa" w:w="50"/>
+              <w:right w:type="dxa" w:w="80"/>
+            </w:tcMar>
+          </w:tcPr>
+          <w:p>
+            <w:pPr>
+              <w:spacing w:after="60" w:before="0"/>
+            </w:pPr>
+            <w:r>
+              <w:rPr>
+                <w:rFonts w:ascii="Arial" w:cs="Arial" w:eastAsia="Arial" w:hAnsi="Arial"/>
+                <w:b/>
+                <w:bCs/>
+                <w:color w:val="C00000"/>
+                <w:sz w:val="17"/>
+                <w:szCs w:val="17"/>
+              </w:rPr>
+              <w:t xml:space="preserve">[FLAG] no change made</w:t>
+            </w:r>
+          </w:p>
+        </w:tc>
+        <w:tc>
+          <w:tcPr>
+            <w:tcW w:type="dxa" w:w="3300"/>
+            <w:tcBorders>
+              <w:top w:val="single" w:color="999999" w:sz="4"/>
+              <w:left w:val="single" w:color="999999" w:sz="4"/>
+              <w:bottom w:val="single" w:color="999999" w:sz="4"/>
+              <w:right w:val="single" w:color="999999" w:sz="4"/>
+            </w:tcBorders>
+            <w:shd w:fill="F8CBAD" w:color="auto" w:val="clear"/>
+            <w:tcMar>
+              <w:top w:type="dxa" w:w="50"/>
+              <w:left w:type="dxa" w:w="80"/>
+              <w:bottom w:type="dxa" w:w="50"/>
+              <w:right w:type="dxa" w:w="80"/>
+            </w:tcMar>
+          </w:tcPr>
+          <w:p>
+            <w:pPr>
+              <w:spacing w:after="60" w:before="0"/>
+            </w:pPr>
+            <w:r>
+              <w:rPr>
+                <w:rFonts w:ascii="Arial" w:cs="Arial" w:eastAsia="Arial" w:hAnsi="Arial"/>
+                <w:sz w:val="17"/>
+                <w:szCs w:val="17"/>
+              </w:rPr>
+              <w:t xml:space="preserve">Unit overview, learningOutcomes</w:t>
+            </w:r>
+          </w:p>
+        </w:tc>
+        <w:tc>
+          <w:tcPr>
+            <w:tcW w:type="dxa" w:w="5780"/>
+            <w:tcBorders>
+              <w:top w:val="single" w:color="999999" w:sz="4"/>
+              <w:left w:val="single" w:color="999999" w:sz="4"/>
+              <w:bottom w:val="single" w:color="999999" w:sz="4"/>
+              <w:right w:val="single" w:color="999999" w:sz="4"/>
+            </w:tcBorders>
+            <w:shd w:fill="F8CBAD" w:color="auto" w:val="clear"/>
+            <w:tcMar>
+              <w:top w:type="dxa" w:w="50"/>
+              <w:left w:type="dxa" w:w="80"/>
+              <w:bottom w:type="dxa" w:w="50"/>
+              <w:right w:type="dxa" w:w="80"/>
+            </w:tcMar>
+          </w:tcPr>
+          <w:p>
+            <w:pPr>
+              <w:spacing w:after="60" w:before="0"/>
+            </w:pPr>
+            <w:r>
+              <w:rPr>
+                <w:rFonts w:ascii="Arial" w:cs="Arial" w:eastAsia="Arial" w:hAnsi="Arial"/>
+                <w:sz w:val="17"/>
+                <w:szCs w:val="17"/>
+              </w:rPr>
+              <w:t xml:space="preserve">KICD check not possible: data/raw/curriculum_pdfs/Grade10_Mathematics_Curriculum.pdf is the CORE Mathematics design (Strand 2.0, 2.1 Similarity and Enlargement, 12 lessons) and does not cover Essential Mathematics. Differences seen against the Core text, whic…</w:t>
+            </w:r>
+          </w:p>
+        </w:tc>
+      </w:tr>
+    </w:tbl>
+    <w:p>
+      <w:pPr>
+        <w:spacing w:after="120" w:before="0"/>
+      </w:pPr>
+      <w:r>
+        <w:rPr>
+          <w:rFonts w:ascii="Arial" w:cs="Arial" w:eastAsia="Arial" w:hAnsi="Arial"/>
+          <w:sz w:val="17"/>
+          <w:szCs w:val="17"/>
+        </w:rPr>
+        <w:t xml:space="preserve"/>
+      </w:r>
+    </w:p>
     <w:tbl>
       <w:tblPr>
         <w:tblW w:type="dxa" w:w="13680"/>
@@ -14092,6 +16101,9 @@
         </w:tc>
       </w:tr>
       <w:tr>
+        <w:trPr>
+          <w:cantSplit w:val="false"/>
+        </w:trPr>
         <w:tc>
           <w:tcPr>
             <w:tcW w:type="dxa" w:w="1300"/>
@@ -14128,6 +16140,7 @@
             <w:pPr>
               <w:spacing w:after="60" w:before="0"/>
             </w:pPr>
+            <w:bookmarkStart w:name="i_essmath_2_1_001" w:id="1"/>
             <w:r>
               <w:rPr>
                 <w:rFonts w:ascii="Arial" w:cs="Arial" w:eastAsia="Arial" w:hAnsi="Arial"/>
@@ -14138,6 +16151,7 @@
               </w:rPr>
               <w:t xml:space="preserve">essmath_2_1-001</w:t>
             </w:r>
+            <w:bookmarkEnd w:id="1"/>
           </w:p>
         </w:tc>
         <w:tc>
@@ -14485,6 +16499,9 @@
         </w:tc>
       </w:tr>
       <w:tr>
+        <w:trPr>
+          <w:cantSplit w:val="false"/>
+        </w:trPr>
         <w:tc>
           <w:tcPr>
             <w:tcW w:type="dxa" w:w="1300"/>
@@ -14521,6 +16538,7 @@
             <w:pPr>
               <w:spacing w:after="60" w:before="0"/>
             </w:pPr>
+            <w:bookmarkStart w:name="i_essmath_2_1_G2" w:id="1"/>
             <w:r>
               <w:rPr>
                 <w:rFonts w:ascii="Arial" w:cs="Arial" w:eastAsia="Arial" w:hAnsi="Arial"/>
@@ -14531,6 +16549,7 @@
               </w:rPr>
               <w:t xml:space="preserve">essmath_2_1 G2 (group)</w:t>
             </w:r>
+            <w:bookmarkEnd w:id="1"/>
           </w:p>
           <w:p>
             <w:pPr>
@@ -15156,6 +17175,9 @@
         </w:tc>
       </w:tr>
       <w:tr>
+        <w:trPr>
+          <w:cantSplit w:val="false"/>
+        </w:trPr>
         <w:tc>
           <w:tcPr>
             <w:tcW w:type="dxa" w:w="1300"/>
@@ -15193,6 +17215,7 @@
             <w:pPr>
               <w:spacing w:after="60" w:before="0"/>
             </w:pPr>
+            <w:bookmarkStart w:name="i_essmath_2_1_G3" w:id="1"/>
             <w:r>
               <w:rPr>
                 <w:rFonts w:ascii="Arial" w:cs="Arial" w:eastAsia="Arial" w:hAnsi="Arial"/>
@@ -15203,6 +17226,7 @@
               </w:rPr>
               <w:t xml:space="preserve">essmath_2_1 G3</w:t>
             </w:r>
+            <w:bookmarkEnd w:id="1"/>
           </w:p>
           <w:p>
             <w:pPr>
@@ -15230,10 +17254,10 @@
                 <w:b/>
                 <w:bCs/>
                 <w:color w:val="C55A11"/>
-                <w:sz w:val="14"/>
-                <w:szCs w:val="14"/>
-              </w:rPr>
-              <w:t xml:space="preserve">TEACHER DECISION</w:t>
+                <w:sz w:val="16"/>
+                <w:szCs w:val="16"/>
+              </w:rPr>
+              <w:t xml:space="preserve">[DECISION] CHANGE PROPOSED: PLEASE CONFIRM</w:t>
             </w:r>
           </w:p>
         </w:tc>
@@ -15587,6 +17611,9 @@
         </w:tc>
       </w:tr>
       <w:tr>
+        <w:trPr>
+          <w:cantSplit w:val="false"/>
+        </w:trPr>
         <w:tc>
           <w:tcPr>
             <w:tcW w:type="dxa" w:w="1300"/>
@@ -15623,6 +17650,7 @@
             <w:pPr>
               <w:spacing w:after="60" w:before="0"/>
             </w:pPr>
+            <w:bookmarkStart w:name="i_essmath_2_1_013" w:id="1"/>
             <w:r>
               <w:rPr>
                 <w:rFonts w:ascii="Arial" w:cs="Arial" w:eastAsia="Arial" w:hAnsi="Arial"/>
@@ -15633,6 +17661,7 @@
               </w:rPr>
               <w:t xml:space="preserve">essmath_2_1-013</w:t>
             </w:r>
+            <w:bookmarkEnd w:id="1"/>
           </w:p>
         </w:tc>
         <w:tc>
@@ -15980,6 +18009,9 @@
         </w:tc>
       </w:tr>
       <w:tr>
+        <w:trPr>
+          <w:cantSplit w:val="false"/>
+        </w:trPr>
         <w:tc>
           <w:tcPr>
             <w:tcW w:type="dxa" w:w="1300"/>
@@ -16016,6 +18048,7 @@
             <w:pPr>
               <w:spacing w:after="60" w:before="0"/>
             </w:pPr>
+            <w:bookmarkStart w:name="i_essmath_2_1_014" w:id="1"/>
             <w:r>
               <w:rPr>
                 <w:rFonts w:ascii="Arial" w:cs="Arial" w:eastAsia="Arial" w:hAnsi="Arial"/>
@@ -16026,6 +18059,7 @@
               </w:rPr>
               <w:t xml:space="preserve">essmath_2_1-014</w:t>
             </w:r>
+            <w:bookmarkEnd w:id="1"/>
           </w:p>
         </w:tc>
         <w:tc>
@@ -16373,6 +18407,9 @@
         </w:tc>
       </w:tr>
       <w:tr>
+        <w:trPr>
+          <w:cantSplit w:val="false"/>
+        </w:trPr>
         <w:tc>
           <w:tcPr>
             <w:tcW w:type="dxa" w:w="1300"/>
@@ -16409,6 +18446,7 @@
             <w:pPr>
               <w:spacing w:after="60" w:before="0"/>
             </w:pPr>
+            <w:bookmarkStart w:name="i_essmath_2_1_015" w:id="1"/>
             <w:r>
               <w:rPr>
                 <w:rFonts w:ascii="Arial" w:cs="Arial" w:eastAsia="Arial" w:hAnsi="Arial"/>
@@ -16419,6 +18457,7 @@
               </w:rPr>
               <w:t xml:space="preserve">essmath_2_1-015</w:t>
             </w:r>
+            <w:bookmarkEnd w:id="1"/>
           </w:p>
         </w:tc>
         <w:tc>
@@ -16766,6 +18805,9 @@
         </w:tc>
       </w:tr>
       <w:tr>
+        <w:trPr>
+          <w:cantSplit w:val="false"/>
+        </w:trPr>
         <w:tc>
           <w:tcPr>
             <w:tcW w:type="dxa" w:w="1300"/>
@@ -16802,6 +18844,7 @@
             <w:pPr>
               <w:spacing w:after="60" w:before="0"/>
             </w:pPr>
+            <w:bookmarkStart w:name="i_essmath_2_1_016" w:id="1"/>
             <w:r>
               <w:rPr>
                 <w:rFonts w:ascii="Arial" w:cs="Arial" w:eastAsia="Arial" w:hAnsi="Arial"/>
@@ -16812,6 +18855,7 @@
               </w:rPr>
               <w:t xml:space="preserve">essmath_2_1-016</w:t>
             </w:r>
+            <w:bookmarkEnd w:id="1"/>
           </w:p>
         </w:tc>
         <w:tc>
@@ -17159,6 +19203,9 @@
         </w:tc>
       </w:tr>
       <w:tr>
+        <w:trPr>
+          <w:cantSplit w:val="false"/>
+        </w:trPr>
         <w:tc>
           <w:tcPr>
             <w:tcW w:type="dxa" w:w="1300"/>
@@ -17195,6 +19242,7 @@
             <w:pPr>
               <w:spacing w:after="60" w:before="0"/>
             </w:pPr>
+            <w:bookmarkStart w:name="i_essmath_2_1_017" w:id="1"/>
             <w:r>
               <w:rPr>
                 <w:rFonts w:ascii="Arial" w:cs="Arial" w:eastAsia="Arial" w:hAnsi="Arial"/>
@@ -17205,6 +19253,7 @@
               </w:rPr>
               <w:t xml:space="preserve">essmath_2_1-017</w:t>
             </w:r>
+            <w:bookmarkEnd w:id="1"/>
           </w:p>
         </w:tc>
         <w:tc>
@@ -17552,6 +19601,9 @@
         </w:tc>
       </w:tr>
       <w:tr>
+        <w:trPr>
+          <w:cantSplit w:val="false"/>
+        </w:trPr>
         <w:tc>
           <w:tcPr>
             <w:tcW w:type="dxa" w:w="1300"/>
@@ -17588,6 +19640,7 @@
             <w:pPr>
               <w:spacing w:after="60" w:before="0"/>
             </w:pPr>
+            <w:bookmarkStart w:name="i_essmath_2_1_018" w:id="1"/>
             <w:r>
               <w:rPr>
                 <w:rFonts w:ascii="Arial" w:cs="Arial" w:eastAsia="Arial" w:hAnsi="Arial"/>
@@ -17598,6 +19651,7 @@
               </w:rPr>
               <w:t xml:space="preserve">essmath_2_1-018</w:t>
             </w:r>
+            <w:bookmarkEnd w:id="1"/>
           </w:p>
         </w:tc>
         <w:tc>
@@ -17945,6 +19999,9 @@
         </w:tc>
       </w:tr>
       <w:tr>
+        <w:trPr>
+          <w:cantSplit w:val="false"/>
+        </w:trPr>
         <w:tc>
           <w:tcPr>
             <w:tcW w:type="dxa" w:w="1300"/>
@@ -17981,6 +20038,7 @@
             <w:pPr>
               <w:spacing w:after="60" w:before="0"/>
             </w:pPr>
+            <w:bookmarkStart w:name="i_essmath_2_1_019" w:id="1"/>
             <w:r>
               <w:rPr>
                 <w:rFonts w:ascii="Arial" w:cs="Arial" w:eastAsia="Arial" w:hAnsi="Arial"/>
@@ -17991,6 +20049,7 @@
               </w:rPr>
               <w:t xml:space="preserve">essmath_2_1-019</w:t>
             </w:r>
+            <w:bookmarkEnd w:id="1"/>
           </w:p>
         </w:tc>
         <w:tc>
@@ -18338,6 +20397,9 @@
         </w:tc>
       </w:tr>
       <w:tr>
+        <w:trPr>
+          <w:cantSplit w:val="false"/>
+        </w:trPr>
         <w:tc>
           <w:tcPr>
             <w:tcW w:type="dxa" w:w="1300"/>
@@ -18374,6 +20436,7 @@
             <w:pPr>
               <w:spacing w:after="60" w:before="0"/>
             </w:pPr>
+            <w:bookmarkStart w:name="i_essmath_2_1_020" w:id="1"/>
             <w:r>
               <w:rPr>
                 <w:rFonts w:ascii="Arial" w:cs="Arial" w:eastAsia="Arial" w:hAnsi="Arial"/>
@@ -18384,6 +20447,7 @@
               </w:rPr>
               <w:t xml:space="preserve">essmath_2_1-020</w:t>
             </w:r>
+            <w:bookmarkEnd w:id="1"/>
           </w:p>
         </w:tc>
         <w:tc>
@@ -18731,6 +20795,9 @@
         </w:tc>
       </w:tr>
       <w:tr>
+        <w:trPr>
+          <w:cantSplit w:val="false"/>
+        </w:trPr>
         <w:tc>
           <w:tcPr>
             <w:tcW w:type="dxa" w:w="1300"/>
@@ -18767,6 +20834,7 @@
             <w:pPr>
               <w:spacing w:after="60" w:before="0"/>
             </w:pPr>
+            <w:bookmarkStart w:name="i_essmath_2_1_021" w:id="1"/>
             <w:r>
               <w:rPr>
                 <w:rFonts w:ascii="Arial" w:cs="Arial" w:eastAsia="Arial" w:hAnsi="Arial"/>
@@ -18777,6 +20845,7 @@
               </w:rPr>
               <w:t xml:space="preserve">essmath_2_1-021</w:t>
             </w:r>
+            <w:bookmarkEnd w:id="1"/>
           </w:p>
           <w:p>
             <w:pPr>
@@ -19140,6 +21209,9 @@
         </w:tc>
       </w:tr>
       <w:tr>
+        <w:trPr>
+          <w:cantSplit w:val="false"/>
+        </w:trPr>
         <w:tc>
           <w:tcPr>
             <w:tcW w:type="dxa" w:w="1300"/>
@@ -19177,6 +21249,7 @@
             <w:pPr>
               <w:spacing w:after="60" w:before="0"/>
             </w:pPr>
+            <w:bookmarkStart w:name="i_essmath_2_1_022" w:id="1"/>
             <w:r>
               <w:rPr>
                 <w:rFonts w:ascii="Arial" w:cs="Arial" w:eastAsia="Arial" w:hAnsi="Arial"/>
@@ -19187,6 +21260,7 @@
               </w:rPr>
               <w:t xml:space="preserve">essmath_2_1-022</w:t>
             </w:r>
+            <w:bookmarkEnd w:id="1"/>
           </w:p>
           <w:p>
             <w:pPr>
@@ -19198,10 +21272,10 @@
                 <w:b/>
                 <w:bCs/>
                 <w:color w:val="C55A11"/>
-                <w:sz w:val="14"/>
-                <w:szCs w:val="14"/>
-              </w:rPr>
-              <w:t xml:space="preserve">TEACHER DECISION</w:t>
+                <w:sz w:val="16"/>
+                <w:szCs w:val="16"/>
+              </w:rPr>
+              <w:t xml:space="preserve">[DECISION] CHANGE PROPOSED: PLEASE CONFIRM</w:t>
             </w:r>
           </w:p>
         </w:tc>
@@ -19555,6 +21629,9 @@
         </w:tc>
       </w:tr>
       <w:tr>
+        <w:trPr>
+          <w:cantSplit w:val="false"/>
+        </w:trPr>
         <w:tc>
           <w:tcPr>
             <w:tcW w:type="dxa" w:w="1300"/>
@@ -19592,6 +21669,7 @@
             <w:pPr>
               <w:spacing w:after="60" w:before="0"/>
             </w:pPr>
+            <w:bookmarkStart w:name="i_essmath_2_1_G14" w:id="1"/>
             <w:r>
               <w:rPr>
                 <w:rFonts w:ascii="Arial" w:cs="Arial" w:eastAsia="Arial" w:hAnsi="Arial"/>
@@ -19602,6 +21680,7 @@
               </w:rPr>
               <w:t xml:space="preserve">essmath_2_1 G14 (group)</w:t>
             </w:r>
+            <w:bookmarkEnd w:id="1"/>
           </w:p>
           <w:p>
             <w:pPr>
@@ -19629,10 +21708,10 @@
                 <w:b/>
                 <w:bCs/>
                 <w:color w:val="C55A11"/>
-                <w:sz w:val="14"/>
-                <w:szCs w:val="14"/>
-              </w:rPr>
-              <w:t xml:space="preserve">TEACHER DECISION</w:t>
+                <w:sz w:val="16"/>
+                <w:szCs w:val="16"/>
+              </w:rPr>
+              <w:t xml:space="preserve">[DECISION] CHANGE PROPOSED: PLEASE CONFIRM</w:t>
             </w:r>
           </w:p>
         </w:tc>
@@ -20104,6 +22183,9 @@
         </w:tc>
       </w:tr>
       <w:tr>
+        <w:trPr>
+          <w:cantSplit w:val="false"/>
+        </w:trPr>
         <w:tc>
           <w:tcPr>
             <w:tcW w:type="dxa" w:w="1300"/>
@@ -20140,6 +22222,7 @@
             <w:pPr>
               <w:spacing w:after="60" w:before="0"/>
             </w:pPr>
+            <w:bookmarkStart w:name="i_essmath_2_1_G15" w:id="1"/>
             <w:r>
               <w:rPr>
                 <w:rFonts w:ascii="Arial" w:cs="Arial" w:eastAsia="Arial" w:hAnsi="Arial"/>
@@ -20150,6 +22233,7 @@
               </w:rPr>
               <w:t xml:space="preserve">essmath_2_1 G15 (group)</w:t>
             </w:r>
+            <w:bookmarkEnd w:id="1"/>
           </w:p>
           <w:p>
             <w:pPr>
@@ -20655,6 +22739,9 @@
         </w:tc>
       </w:tr>
       <w:tr>
+        <w:trPr>
+          <w:cantSplit w:val="false"/>
+        </w:trPr>
         <w:tc>
           <w:tcPr>
             <w:tcW w:type="dxa" w:w="1300"/>
@@ -20691,6 +22778,7 @@
             <w:pPr>
               <w:spacing w:after="60" w:before="0"/>
             </w:pPr>
+            <w:bookmarkStart w:name="i_essmath_2_1_032" w:id="1"/>
             <w:r>
               <w:rPr>
                 <w:rFonts w:ascii="Arial" w:cs="Arial" w:eastAsia="Arial" w:hAnsi="Arial"/>
@@ -20701,6 +22789,7 @@
               </w:rPr>
               <w:t xml:space="preserve">essmath_2_1-032</w:t>
             </w:r>
+            <w:bookmarkEnd w:id="1"/>
           </w:p>
         </w:tc>
         <w:tc>
@@ -21048,6 +23137,9 @@
         </w:tc>
       </w:tr>
       <w:tr>
+        <w:trPr>
+          <w:cantSplit w:val="false"/>
+        </w:trPr>
         <w:tc>
           <w:tcPr>
             <w:tcW w:type="dxa" w:w="1300"/>
@@ -21084,6 +23176,7 @@
             <w:pPr>
               <w:spacing w:after="60" w:before="0"/>
             </w:pPr>
+            <w:bookmarkStart w:name="i_essmath_2_1_033" w:id="1"/>
             <w:r>
               <w:rPr>
                 <w:rFonts w:ascii="Arial" w:cs="Arial" w:eastAsia="Arial" w:hAnsi="Arial"/>
@@ -21094,6 +23187,7 @@
               </w:rPr>
               <w:t xml:space="preserve">essmath_2_1-033</w:t>
             </w:r>
+            <w:bookmarkEnd w:id="1"/>
           </w:p>
         </w:tc>
         <w:tc>
@@ -21441,6 +23535,9 @@
         </w:tc>
       </w:tr>
       <w:tr>
+        <w:trPr>
+          <w:cantSplit w:val="false"/>
+        </w:trPr>
         <w:tc>
           <w:tcPr>
             <w:tcW w:type="dxa" w:w="1300"/>
@@ -21450,7 +23547,7 @@
               <w:bottom w:val="single" w:color="999999" w:sz="4"/>
               <w:right w:val="single" w:color="999999" w:sz="4"/>
             </w:tcBorders>
-            <w:shd w:fill="FFF2CC" w:color="auto" w:val="clear"/>
+            <w:shd w:fill="F8CBAD" w:color="auto" w:val="clear"/>
             <w:tcMar>
               <w:top w:type="dxa" w:w="50"/>
               <w:left w:type="dxa" w:w="80"/>
@@ -21478,6 +23575,7 @@
             <w:pPr>
               <w:spacing w:after="60" w:before="0"/>
             </w:pPr>
+            <w:bookmarkStart w:name="i_essmath_2_1_034" w:id="1"/>
             <w:r>
               <w:rPr>
                 <w:rFonts w:ascii="Arial" w:cs="Arial" w:eastAsia="Arial" w:hAnsi="Arial"/>
@@ -21488,6 +23586,7 @@
               </w:rPr>
               <w:t xml:space="preserve">essmath_2_1-034</w:t>
             </w:r>
+            <w:bookmarkEnd w:id="1"/>
           </w:p>
           <w:p>
             <w:pPr>
@@ -21498,27 +23597,11 @@
                 <w:rFonts w:ascii="Arial" w:cs="Arial" w:eastAsia="Arial" w:hAnsi="Arial"/>
                 <w:b/>
                 <w:bCs/>
-                <w:color w:val="C55A11"/>
-                <w:sz w:val="14"/>
-                <w:szCs w:val="14"/>
-              </w:rPr>
-              <w:t xml:space="preserve">TEACHER DECISION</w:t>
-            </w:r>
-          </w:p>
-          <w:p>
-            <w:pPr>
-              <w:spacing w:after="10" w:before="0"/>
-            </w:pPr>
-            <w:r>
-              <w:rPr>
-                <w:rFonts w:ascii="Arial" w:cs="Arial" w:eastAsia="Arial" w:hAnsi="Arial"/>
-                <w:b/>
-                <w:bCs/>
-                <w:color w:val="C55A11"/>
-                <w:sz w:val="14"/>
-                <w:szCs w:val="14"/>
-              </w:rPr>
-              <w:t xml:space="preserve">FLAG</w:t>
+                <w:color w:val="C00000"/>
+                <w:sz w:val="16"/>
+                <w:szCs w:val="16"/>
+              </w:rPr>
+              <w:t xml:space="preserve">[FLAG] NO CHANGE MADE: YOUR DECISION NEEDED</w:t>
             </w:r>
           </w:p>
         </w:tc>
@@ -21531,7 +23614,7 @@
               <w:bottom w:val="single" w:color="999999" w:sz="4"/>
               <w:right w:val="single" w:color="999999" w:sz="4"/>
             </w:tcBorders>
-            <w:shd w:fill="FFF2CC" w:color="auto" w:val="clear"/>
+            <w:shd w:fill="F8CBAD" w:color="auto" w:val="clear"/>
             <w:tcMar>
               <w:top w:type="dxa" w:w="50"/>
               <w:left w:type="dxa" w:w="80"/>
@@ -21577,7 +23660,7 @@
               <w:bottom w:val="single" w:color="999999" w:sz="4"/>
               <w:right w:val="single" w:color="999999" w:sz="4"/>
             </w:tcBorders>
-            <w:shd w:fill="FFF2CC" w:color="auto" w:val="clear"/>
+            <w:shd w:fill="F8CBAD" w:color="auto" w:val="clear"/>
             <w:tcMar>
               <w:top w:type="dxa" w:w="50"/>
               <w:left w:type="dxa" w:w="80"/>
@@ -21610,7 +23693,7 @@
               <w:bottom w:val="single" w:color="999999" w:sz="4"/>
               <w:right w:val="single" w:color="999999" w:sz="4"/>
             </w:tcBorders>
-            <w:shd w:fill="FFF2CC" w:color="auto" w:val="clear"/>
+            <w:shd w:fill="F8CBAD" w:color="auto" w:val="clear"/>
             <w:tcMar>
               <w:top w:type="dxa" w:w="50"/>
               <w:left w:type="dxa" w:w="80"/>
@@ -21657,7 +23740,7 @@
               <w:bottom w:val="single" w:color="999999" w:sz="4"/>
               <w:right w:val="single" w:color="999999" w:sz="4"/>
             </w:tcBorders>
-            <w:shd w:fill="FFF2CC" w:color="auto" w:val="clear"/>
+            <w:shd w:fill="F8CBAD" w:color="auto" w:val="clear"/>
             <w:tcMar>
               <w:top w:type="dxa" w:w="50"/>
               <w:left w:type="dxa" w:w="80"/>
@@ -21688,7 +23771,7 @@
               <w:bottom w:val="single" w:color="999999" w:sz="4"/>
               <w:right w:val="single" w:color="999999" w:sz="4"/>
             </w:tcBorders>
-            <w:shd w:fill="FFF2CC" w:color="auto" w:val="clear"/>
+            <w:shd w:fill="F8CBAD" w:color="auto" w:val="clear"/>
             <w:tcMar>
               <w:top w:type="dxa" w:w="50"/>
               <w:left w:type="dxa" w:w="80"/>
@@ -21825,6 +23908,9 @@
         </w:tc>
       </w:tr>
       <w:tr>
+        <w:trPr>
+          <w:cantSplit w:val="false"/>
+        </w:trPr>
         <w:tc>
           <w:tcPr>
             <w:tcW w:type="dxa" w:w="1300"/>
@@ -21834,7 +23920,7 @@
               <w:bottom w:val="single" w:color="999999" w:sz="4"/>
               <w:right w:val="single" w:color="999999" w:sz="4"/>
             </w:tcBorders>
-            <w:shd w:fill="FFF2CC" w:color="auto" w:val="clear"/>
+            <w:shd w:fill="F8CBAD" w:color="auto" w:val="clear"/>
             <w:tcMar>
               <w:top w:type="dxa" w:w="50"/>
               <w:left w:type="dxa" w:w="80"/>
@@ -21862,6 +23948,7 @@
             <w:pPr>
               <w:spacing w:after="60" w:before="0"/>
             </w:pPr>
+            <w:bookmarkStart w:name="i_essmath_2_1_035" w:id="1"/>
             <w:r>
               <w:rPr>
                 <w:rFonts w:ascii="Arial" w:cs="Arial" w:eastAsia="Arial" w:hAnsi="Arial"/>
@@ -21872,6 +23959,7 @@
               </w:rPr>
               <w:t xml:space="preserve">essmath_2_1-035</w:t>
             </w:r>
+            <w:bookmarkEnd w:id="1"/>
           </w:p>
           <w:p>
             <w:pPr>
@@ -21898,27 +23986,11 @@
                 <w:rFonts w:ascii="Arial" w:cs="Arial" w:eastAsia="Arial" w:hAnsi="Arial"/>
                 <w:b/>
                 <w:bCs/>
-                <w:color w:val="C55A11"/>
-                <w:sz w:val="14"/>
-                <w:szCs w:val="14"/>
-              </w:rPr>
-              <w:t xml:space="preserve">TEACHER DECISION</w:t>
-            </w:r>
-          </w:p>
-          <w:p>
-            <w:pPr>
-              <w:spacing w:after="10" w:before="0"/>
-            </w:pPr>
-            <w:r>
-              <w:rPr>
-                <w:rFonts w:ascii="Arial" w:cs="Arial" w:eastAsia="Arial" w:hAnsi="Arial"/>
-                <w:b/>
-                <w:bCs/>
-                <w:color w:val="C55A11"/>
-                <w:sz w:val="14"/>
-                <w:szCs w:val="14"/>
-              </w:rPr>
-              <w:t xml:space="preserve">FLAG</w:t>
+                <w:color w:val="C00000"/>
+                <w:sz w:val="16"/>
+                <w:szCs w:val="16"/>
+              </w:rPr>
+              <w:t xml:space="preserve">[FLAG] NO CHANGE MADE: YOUR DECISION NEEDED</w:t>
             </w:r>
           </w:p>
         </w:tc>
@@ -21931,7 +24003,7 @@
               <w:bottom w:val="single" w:color="999999" w:sz="4"/>
               <w:right w:val="single" w:color="999999" w:sz="4"/>
             </w:tcBorders>
-            <w:shd w:fill="FFF2CC" w:color="auto" w:val="clear"/>
+            <w:shd w:fill="F8CBAD" w:color="auto" w:val="clear"/>
             <w:tcMar>
               <w:top w:type="dxa" w:w="50"/>
               <w:left w:type="dxa" w:w="80"/>
@@ -21977,7 +24049,7 @@
               <w:bottom w:val="single" w:color="999999" w:sz="4"/>
               <w:right w:val="single" w:color="999999" w:sz="4"/>
             </w:tcBorders>
-            <w:shd w:fill="FFF2CC" w:color="auto" w:val="clear"/>
+            <w:shd w:fill="F8CBAD" w:color="auto" w:val="clear"/>
             <w:tcMar>
               <w:top w:type="dxa" w:w="50"/>
               <w:left w:type="dxa" w:w="80"/>
@@ -22010,7 +24082,7 @@
               <w:bottom w:val="single" w:color="999999" w:sz="4"/>
               <w:right w:val="single" w:color="999999" w:sz="4"/>
             </w:tcBorders>
-            <w:shd w:fill="FFF2CC" w:color="auto" w:val="clear"/>
+            <w:shd w:fill="F8CBAD" w:color="auto" w:val="clear"/>
             <w:tcMar>
               <w:top w:type="dxa" w:w="50"/>
               <w:left w:type="dxa" w:w="80"/>
@@ -22057,7 +24129,7 @@
               <w:bottom w:val="single" w:color="999999" w:sz="4"/>
               <w:right w:val="single" w:color="999999" w:sz="4"/>
             </w:tcBorders>
-            <w:shd w:fill="FFF2CC" w:color="auto" w:val="clear"/>
+            <w:shd w:fill="F8CBAD" w:color="auto" w:val="clear"/>
             <w:tcMar>
               <w:top w:type="dxa" w:w="50"/>
               <w:left w:type="dxa" w:w="80"/>
@@ -22088,7 +24160,7 @@
               <w:bottom w:val="single" w:color="999999" w:sz="4"/>
               <w:right w:val="single" w:color="999999" w:sz="4"/>
             </w:tcBorders>
-            <w:shd w:fill="FFF2CC" w:color="auto" w:val="clear"/>
+            <w:shd w:fill="F8CBAD" w:color="auto" w:val="clear"/>
             <w:tcMar>
               <w:top w:type="dxa" w:w="50"/>
               <w:left w:type="dxa" w:w="80"/>

</xml_diff>